<commit_message>
descripcion del proyecto general 1q
</commit_message>
<xml_diff>
--- a/00_proyecto_inicial/descripcion.docx
+++ b/00_proyecto_inicial/descripcion.docx
@@ -8,7 +8,6 @@
           <w:bottom w:val="single" w:sz="4" w:space="1" w:color="auto"/>
         </w:pBdr>
         <w:spacing w:before="60" w:after="60" w:line="240" w:lineRule="auto"/>
-        <w:jc w:val="center"/>
         <w:rPr>
           <w:b/>
           <w:sz w:val="30"/>
@@ -100,6 +99,46 @@
           <w:bCs/>
         </w:rPr>
         <w:t>proyecto/</w:t>
+      </w:r>
+    </w:p>
+    <w:p>
+      <w:pPr>
+        <w:spacing w:before="0" w:after="0" w:line="240" w:lineRule="auto"/>
+        <w:rPr>
+          <w:b/>
+          <w:bCs/>
+        </w:rPr>
+      </w:pPr>
+      <w:r>
+        <w:rPr>
+          <w:rFonts w:ascii="MS Gothic" w:eastAsia="MS Gothic" w:hAnsi="MS Gothic" w:cs="MS Gothic" w:hint="eastAsia"/>
+          <w:b/>
+          <w:bCs/>
+        </w:rPr>
+        <w:t>├</w:t>
+      </w:r>
+      <w:r>
+        <w:rPr>
+          <w:b/>
+          <w:bCs/>
+        </w:rPr>
+        <w:t xml:space="preserve">── </w:t>
+      </w:r>
+      <w:proofErr w:type="spellStart"/>
+      <w:r>
+        <w:rPr>
+          <w:b/>
+          <w:bCs/>
+        </w:rPr>
+        <w:t>docker</w:t>
+      </w:r>
+      <w:proofErr w:type="spellEnd"/>
+      <w:r>
+        <w:rPr>
+          <w:b/>
+          <w:bCs/>
+        </w:rPr>
+        <w:t>/</w:t>
       </w:r>
     </w:p>
     <w:p>
@@ -379,7 +418,6 @@
           <w:numId w:val="31"/>
         </w:numPr>
         <w:spacing w:before="60" w:after="60" w:line="312" w:lineRule="auto"/>
-        <w:jc w:val="left"/>
       </w:pPr>
       <w:r>
         <w:t xml:space="preserve">Obtener la fecha actual con formato </w:t>
@@ -400,7 +438,6 @@
           <w:numId w:val="31"/>
         </w:numPr>
         <w:spacing w:before="60" w:after="60" w:line="312" w:lineRule="auto"/>
-        <w:jc w:val="left"/>
       </w:pPr>
       <w:r>
         <w:t>Mostrar esa fecha por pantalla.</w:t>
@@ -413,7 +450,6 @@
           <w:numId w:val="31"/>
         </w:numPr>
         <w:spacing w:before="60" w:after="60" w:line="312" w:lineRule="auto"/>
-        <w:jc w:val="left"/>
       </w:pPr>
       <w:r>
         <w:t>Copiar ../</w:t>
@@ -466,7 +502,6 @@
           <w:numId w:val="31"/>
         </w:numPr>
         <w:spacing w:before="60" w:after="60" w:line="312" w:lineRule="auto"/>
-        <w:jc w:val="left"/>
       </w:pPr>
       <w:r>
         <w:t>La copia debe llamarse:</w:t>
@@ -515,7 +550,6 @@
           <w:numId w:val="32"/>
         </w:numPr>
         <w:spacing w:before="60" w:after="60" w:line="312" w:lineRule="auto"/>
-        <w:jc w:val="left"/>
       </w:pPr>
       <w:r>
         <w:t>Ejecutar el script Python python.py.</w:t>
@@ -552,7 +586,6 @@
           <w:numId w:val="33"/>
         </w:numPr>
         <w:spacing w:before="60" w:after="60" w:line="312" w:lineRule="auto"/>
-        <w:jc w:val="left"/>
       </w:pPr>
       <w:r>
         <w:t xml:space="preserve">Importar </w:t>
@@ -581,7 +614,6 @@
           <w:numId w:val="33"/>
         </w:numPr>
         <w:spacing w:before="60" w:after="60" w:line="312" w:lineRule="auto"/>
-        <w:jc w:val="left"/>
       </w:pPr>
       <w:r>
         <w:t xml:space="preserve">Obtener la fecha actual con el mismo formato: </w:t>
@@ -602,7 +634,6 @@
           <w:numId w:val="33"/>
         </w:numPr>
         <w:spacing w:before="60" w:after="60" w:line="312" w:lineRule="auto"/>
-        <w:jc w:val="left"/>
       </w:pPr>
       <w:r>
         <w:t>Leer el archivo:</w:t>
@@ -639,7 +670,6 @@
           <w:numId w:val="34"/>
         </w:numPr>
         <w:spacing w:before="60" w:after="60" w:line="312" w:lineRule="auto"/>
-        <w:jc w:val="left"/>
       </w:pPr>
       <w:r>
         <w:t>Recorrer todas las filas del CSV.</w:t>
@@ -652,7 +682,6 @@
           <w:numId w:val="34"/>
         </w:numPr>
         <w:spacing w:before="60" w:after="60" w:line="312" w:lineRule="auto"/>
-        <w:jc w:val="left"/>
       </w:pPr>
       <w:r>
         <w:t>Detectar si una fila contiene algún dato ausente.</w:t>
@@ -665,9 +694,9 @@
           <w:numId w:val="34"/>
         </w:numPr>
         <w:spacing w:before="60" w:after="60" w:line="312" w:lineRule="auto"/>
-        <w:jc w:val="left"/>
-      </w:pPr>
-      <w:r>
+      </w:pPr>
+      <w:r>
+        <w:lastRenderedPageBreak/>
         <w:t>Si una fila tiene un dato ausente, añadirla a una lista de filas rechazadas.</w:t>
       </w:r>
     </w:p>
@@ -678,10 +707,8 @@
           <w:numId w:val="34"/>
         </w:numPr>
         <w:spacing w:before="60" w:after="60" w:line="312" w:lineRule="auto"/>
-        <w:jc w:val="left"/>
-      </w:pPr>
-      <w:r>
-        <w:lastRenderedPageBreak/>
+      </w:pPr>
+      <w:r>
         <w:t>Si una fila no tiene datos ausentes, añadirla a una lista de filas importadas.</w:t>
       </w:r>
     </w:p>
@@ -692,7 +719,6 @@
           <w:numId w:val="34"/>
         </w:numPr>
         <w:spacing w:before="60" w:after="60" w:line="312" w:lineRule="auto"/>
-        <w:jc w:val="left"/>
       </w:pPr>
       <w:r>
         <w:t>Crear dos archivos dentro de la carpeta logs:</w:t>
@@ -745,7 +771,6 @@
           <w:numId w:val="35"/>
         </w:numPr>
         <w:spacing w:before="60" w:after="60" w:line="312" w:lineRule="auto"/>
-        <w:jc w:val="left"/>
       </w:pPr>
       <w:r>
         <w:t>En el archivo de rechazadas debe aparecer:</w:t>
@@ -758,7 +783,6 @@
           <w:numId w:val="35"/>
         </w:numPr>
         <w:spacing w:before="60" w:after="60" w:line="312" w:lineRule="auto"/>
-        <w:jc w:val="left"/>
       </w:pPr>
       <w:r>
         <w:t>Una primera línea indicando cuántas filas han sido rechazadas.</w:t>
@@ -771,7 +795,6 @@
           <w:numId w:val="35"/>
         </w:numPr>
         <w:spacing w:before="60" w:after="60" w:line="312" w:lineRule="auto"/>
-        <w:jc w:val="left"/>
       </w:pPr>
       <w:r>
         <w:t>Las filas rechazadas debajo.</w:t>
@@ -784,7 +807,6 @@
           <w:numId w:val="35"/>
         </w:numPr>
         <w:spacing w:before="60" w:after="60" w:line="312" w:lineRule="auto"/>
-        <w:jc w:val="left"/>
       </w:pPr>
       <w:r>
         <w:t>En el archivo de importadas debe aparecer:</w:t>
@@ -797,7 +819,6 @@
           <w:numId w:val="35"/>
         </w:numPr>
         <w:spacing w:before="60" w:after="60" w:line="312" w:lineRule="auto"/>
-        <w:jc w:val="left"/>
       </w:pPr>
       <w:r>
         <w:t>Una primera línea indicando cuántas filas han sido importadas correctamente.</w:t>
@@ -833,17 +854,17 @@
         <w:rPr>
           <w:b/>
           <w:bCs/>
-        </w:rPr>
-      </w:pPr>
-      <w:proofErr w:type="spellStart"/>
+          <w:lang w:val="en-US"/>
+        </w:rPr>
+      </w:pPr>
       <w:r>
         <w:rPr>
           <w:b/>
           <w:bCs/>
+          <w:lang w:val="en-US"/>
         </w:rPr>
         <w:t>Rejected</w:t>
       </w:r>
-      <w:proofErr w:type="spellEnd"/>
     </w:p>
     <w:p>
       <w:pPr>
@@ -981,7 +1002,12 @@
     </w:p>
     <w:p>
       <w:pPr>
-        <w:spacing w:before="60" w:after="60" w:line="312" w:lineRule="auto"/>
+        <w:spacing w:before="0" w:after="200" w:line="276" w:lineRule="auto"/>
+      </w:pPr>
+    </w:p>
+    <w:p>
+      <w:pPr>
+        <w:spacing w:before="0" w:after="200" w:line="276" w:lineRule="auto"/>
         <w:rPr>
           <w:b/>
           <w:bCs/>
@@ -992,6 +1018,1081 @@
           <w:b/>
           <w:bCs/>
         </w:rPr>
+        <w:t>Además de los requisitos anteriores, el script python.py debe incorporar estas funciones.</w:t>
+      </w:r>
+    </w:p>
+    <w:p>
+      <w:pPr>
+        <w:numPr>
+          <w:ilvl w:val="0"/>
+          <w:numId w:val="35"/>
+        </w:numPr>
+        <w:spacing w:before="60" w:after="60" w:line="312" w:lineRule="auto"/>
+      </w:pPr>
+      <w:r>
+        <w:t xml:space="preserve">Crea </w:t>
+      </w:r>
+      <w:r>
+        <w:t>un</w:t>
+      </w:r>
+      <w:r>
+        <w:t xml:space="preserve">a clase </w:t>
+      </w:r>
+      <w:proofErr w:type="spellStart"/>
+      <w:r>
+        <w:t>U</w:t>
+      </w:r>
+      <w:r>
+        <w:t>ser</w:t>
+      </w:r>
+      <w:proofErr w:type="spellEnd"/>
+      <w:r>
+        <w:t xml:space="preserve"> para representar a cada usuario válido del CSV</w:t>
+      </w:r>
+      <w:r>
+        <w:t xml:space="preserve">, </w:t>
+      </w:r>
+      <w:r>
+        <w:t>debe almacenar estos atributos:</w:t>
+      </w:r>
+    </w:p>
+    <w:p>
+      <w:pPr>
+        <w:numPr>
+          <w:ilvl w:val="1"/>
+          <w:numId w:val="35"/>
+        </w:numPr>
+        <w:spacing w:before="60" w:after="60" w:line="312" w:lineRule="auto"/>
+      </w:pPr>
+      <w:r>
+        <w:t>name</w:t>
+      </w:r>
+    </w:p>
+    <w:p>
+      <w:pPr>
+        <w:numPr>
+          <w:ilvl w:val="1"/>
+          <w:numId w:val="35"/>
+        </w:numPr>
+        <w:spacing w:before="60" w:after="60" w:line="312" w:lineRule="auto"/>
+      </w:pPr>
+      <w:r>
+        <w:t>surname</w:t>
+      </w:r>
+    </w:p>
+    <w:p>
+      <w:pPr>
+        <w:numPr>
+          <w:ilvl w:val="1"/>
+          <w:numId w:val="35"/>
+        </w:numPr>
+        <w:spacing w:before="60" w:after="60" w:line="312" w:lineRule="auto"/>
+      </w:pPr>
+      <w:r>
+        <w:t>email</w:t>
+      </w:r>
+    </w:p>
+    <w:p>
+      <w:pPr>
+        <w:numPr>
+          <w:ilvl w:val="1"/>
+          <w:numId w:val="35"/>
+        </w:numPr>
+        <w:spacing w:before="60" w:after="60" w:line="312" w:lineRule="auto"/>
+      </w:pPr>
+      <w:r>
+        <w:t>genre</w:t>
+      </w:r>
+    </w:p>
+    <w:p>
+      <w:pPr>
+        <w:numPr>
+          <w:ilvl w:val="1"/>
+          <w:numId w:val="35"/>
+        </w:numPr>
+        <w:spacing w:before="60" w:after="60" w:line="312" w:lineRule="auto"/>
+      </w:pPr>
+      <w:r>
+        <w:t>birth</w:t>
+      </w:r>
+    </w:p>
+    <w:p>
+      <w:pPr>
+        <w:numPr>
+          <w:ilvl w:val="1"/>
+          <w:numId w:val="35"/>
+        </w:numPr>
+        <w:spacing w:before="60" w:after="60" w:line="312" w:lineRule="auto"/>
+      </w:pPr>
+      <w:r>
+        <w:t>phone</w:t>
+      </w:r>
+    </w:p>
+    <w:p>
+      <w:pPr>
+        <w:numPr>
+          <w:ilvl w:val="1"/>
+          <w:numId w:val="35"/>
+        </w:numPr>
+        <w:spacing w:before="60" w:after="60" w:line="312" w:lineRule="auto"/>
+      </w:pPr>
+      <w:r>
+        <w:t>country</w:t>
+      </w:r>
+    </w:p>
+    <w:p>
+      <w:pPr>
+        <w:numPr>
+          <w:ilvl w:val="1"/>
+          <w:numId w:val="35"/>
+        </w:numPr>
+        <w:spacing w:before="60" w:after="60" w:line="312" w:lineRule="auto"/>
+      </w:pPr>
+      <w:proofErr w:type="spellStart"/>
+      <w:r>
+        <w:t>city</w:t>
+      </w:r>
+      <w:proofErr w:type="spellEnd"/>
+    </w:p>
+    <w:p>
+      <w:pPr>
+        <w:numPr>
+          <w:ilvl w:val="1"/>
+          <w:numId w:val="35"/>
+        </w:numPr>
+        <w:spacing w:before="60" w:after="60" w:line="312" w:lineRule="auto"/>
+      </w:pPr>
+      <w:proofErr w:type="spellStart"/>
+      <w:r>
+        <w:lastRenderedPageBreak/>
+        <w:t>state</w:t>
+      </w:r>
+      <w:proofErr w:type="spellEnd"/>
+    </w:p>
+    <w:p>
+      <w:pPr>
+        <w:numPr>
+          <w:ilvl w:val="0"/>
+          <w:numId w:val="35"/>
+        </w:numPr>
+        <w:spacing w:before="60" w:after="60" w:line="312" w:lineRule="auto"/>
+      </w:pPr>
+      <w:r>
+        <w:t>Crear una lista de usuarios válidos</w:t>
+      </w:r>
+      <w:r>
+        <w:t xml:space="preserve"> (junto con los importados). </w:t>
+      </w:r>
+      <w:r>
+        <w:t>Cuando una fila no tenga datos ausentes:</w:t>
+      </w:r>
+    </w:p>
+    <w:p>
+      <w:pPr>
+        <w:numPr>
+          <w:ilvl w:val="1"/>
+          <w:numId w:val="35"/>
+        </w:numPr>
+        <w:spacing w:before="60" w:after="60" w:line="312" w:lineRule="auto"/>
+      </w:pPr>
+      <w:r>
+        <w:t>Debe añadirse a la lista de filas importadas.</w:t>
+      </w:r>
+    </w:p>
+    <w:p>
+      <w:pPr>
+        <w:numPr>
+          <w:ilvl w:val="1"/>
+          <w:numId w:val="35"/>
+        </w:numPr>
+        <w:spacing w:before="60" w:after="60" w:line="312" w:lineRule="auto"/>
+      </w:pPr>
+      <w:r>
+        <w:t xml:space="preserve">Debe crearse un objeto de la clase </w:t>
+      </w:r>
+      <w:proofErr w:type="spellStart"/>
+      <w:r>
+        <w:t>User</w:t>
+      </w:r>
+      <w:proofErr w:type="spellEnd"/>
+      <w:r>
+        <w:t xml:space="preserve"> con los datos de esa fila.</w:t>
+      </w:r>
+    </w:p>
+    <w:p>
+      <w:pPr>
+        <w:numPr>
+          <w:ilvl w:val="1"/>
+          <w:numId w:val="35"/>
+        </w:numPr>
+        <w:spacing w:before="60" w:after="60" w:line="312" w:lineRule="auto"/>
+      </w:pPr>
+      <w:r>
+        <w:t xml:space="preserve">El objeto creado debe añadirse a la lista </w:t>
+      </w:r>
+      <w:proofErr w:type="spellStart"/>
+      <w:r>
+        <w:t>users</w:t>
+      </w:r>
+      <w:proofErr w:type="spellEnd"/>
+      <w:r>
+        <w:t>.</w:t>
+      </w:r>
+    </w:p>
+    <w:p>
+      <w:pPr>
+        <w:numPr>
+          <w:ilvl w:val="0"/>
+          <w:numId w:val="35"/>
+        </w:numPr>
+        <w:spacing w:before="0" w:after="200" w:line="276" w:lineRule="auto"/>
+      </w:pPr>
+      <w:r>
+        <w:t>Conectar con PostgreSQL</w:t>
+      </w:r>
+      <w:r>
+        <w:t xml:space="preserve">. </w:t>
+      </w:r>
+      <w:r>
+        <w:t>El script debe importar la librería necesaria para conectar con PostgreSQL:</w:t>
+      </w:r>
+    </w:p>
+    <w:p>
+      <w:pPr>
+        <w:numPr>
+          <w:ilvl w:val="1"/>
+          <w:numId w:val="35"/>
+        </w:numPr>
+        <w:spacing w:before="60" w:after="60" w:line="312" w:lineRule="auto"/>
+      </w:pPr>
+      <w:proofErr w:type="spellStart"/>
+      <w:r>
+        <w:t>import</w:t>
+      </w:r>
+      <w:proofErr w:type="spellEnd"/>
+      <w:r>
+        <w:t xml:space="preserve"> psycopg2</w:t>
+      </w:r>
+    </w:p>
+    <w:p>
+      <w:pPr>
+        <w:numPr>
+          <w:ilvl w:val="0"/>
+          <w:numId w:val="35"/>
+        </w:numPr>
+        <w:spacing w:before="60" w:after="60" w:line="312" w:lineRule="auto"/>
+      </w:pPr>
+      <w:r>
+        <w:t>C</w:t>
+      </w:r>
+      <w:r>
+        <w:t>rear una función llamada:</w:t>
+      </w:r>
+    </w:p>
+    <w:p>
+      <w:pPr>
+        <w:numPr>
+          <w:ilvl w:val="1"/>
+          <w:numId w:val="35"/>
+        </w:numPr>
+        <w:spacing w:before="60" w:after="60" w:line="312" w:lineRule="auto"/>
+      </w:pPr>
+      <w:proofErr w:type="spellStart"/>
+      <w:r>
+        <w:t>database_init_</w:t>
+      </w:r>
+      <w:proofErr w:type="gramStart"/>
+      <w:r>
+        <w:t>connection</w:t>
+      </w:r>
+      <w:proofErr w:type="spellEnd"/>
+      <w:r>
+        <w:t>(</w:t>
+      </w:r>
+      <w:proofErr w:type="gramEnd"/>
+      <w:r>
+        <w:t>)</w:t>
+      </w:r>
+    </w:p>
+    <w:p>
+      <w:pPr>
+        <w:numPr>
+          <w:ilvl w:val="0"/>
+          <w:numId w:val="35"/>
+        </w:numPr>
+        <w:spacing w:before="60" w:after="60" w:line="312" w:lineRule="auto"/>
+      </w:pPr>
+      <w:r>
+        <w:t>Esta función debe establecer una conexión con la base de datos PostgreSQL utilizando estos datos:</w:t>
+      </w:r>
+    </w:p>
+    <w:p>
+      <w:pPr>
+        <w:numPr>
+          <w:ilvl w:val="1"/>
+          <w:numId w:val="35"/>
+        </w:numPr>
+        <w:spacing w:before="60" w:after="60" w:line="312" w:lineRule="auto"/>
+      </w:pPr>
+      <w:r>
+        <w:t>Base de datos: proyecto0</w:t>
+      </w:r>
+    </w:p>
+    <w:p>
+      <w:pPr>
+        <w:numPr>
+          <w:ilvl w:val="1"/>
+          <w:numId w:val="35"/>
+        </w:numPr>
+        <w:spacing w:before="60" w:after="60" w:line="312" w:lineRule="auto"/>
+      </w:pPr>
+      <w:r>
+        <w:t xml:space="preserve">Usuario: </w:t>
+      </w:r>
+      <w:proofErr w:type="spellStart"/>
+      <w:r>
+        <w:t>admin</w:t>
+      </w:r>
+      <w:proofErr w:type="spellEnd"/>
+    </w:p>
+    <w:p>
+      <w:pPr>
+        <w:numPr>
+          <w:ilvl w:val="1"/>
+          <w:numId w:val="35"/>
+        </w:numPr>
+        <w:spacing w:before="60" w:after="60" w:line="312" w:lineRule="auto"/>
+      </w:pPr>
+      <w:r>
+        <w:t>Host: localhost</w:t>
+      </w:r>
+    </w:p>
+    <w:p>
+      <w:pPr>
+        <w:numPr>
+          <w:ilvl w:val="1"/>
+          <w:numId w:val="35"/>
+        </w:numPr>
+        <w:spacing w:before="60" w:after="60" w:line="312" w:lineRule="auto"/>
+      </w:pPr>
+      <w:r>
+        <w:t>Contraseña: admin123</w:t>
+      </w:r>
+    </w:p>
+    <w:p>
+      <w:pPr>
+        <w:numPr>
+          <w:ilvl w:val="1"/>
+          <w:numId w:val="35"/>
+        </w:numPr>
+        <w:spacing w:before="60" w:after="60" w:line="312" w:lineRule="auto"/>
+      </w:pPr>
+      <w:r>
+        <w:t>Puerto: 5432</w:t>
+      </w:r>
+    </w:p>
+    <w:p>
+      <w:pPr>
+        <w:numPr>
+          <w:ilvl w:val="0"/>
+          <w:numId w:val="35"/>
+        </w:numPr>
+        <w:spacing w:before="60" w:after="60" w:line="312" w:lineRule="auto"/>
+      </w:pPr>
+      <w:r>
+        <w:t>Insertar los usuarios válidos</w:t>
+      </w:r>
+      <w:r>
+        <w:t xml:space="preserve"> </w:t>
+      </w:r>
+      <w:r>
+        <w:t>crea</w:t>
+      </w:r>
+      <w:r>
+        <w:t>ndo</w:t>
+      </w:r>
+      <w:r>
+        <w:t xml:space="preserve"> una función llamada:</w:t>
+      </w:r>
+    </w:p>
+    <w:p>
+      <w:pPr>
+        <w:numPr>
+          <w:ilvl w:val="1"/>
+          <w:numId w:val="35"/>
+        </w:numPr>
+        <w:spacing w:before="60" w:after="60" w:line="312" w:lineRule="auto"/>
+        <w:rPr>
+          <w:lang w:val="en-US"/>
+        </w:rPr>
+      </w:pPr>
+      <w:proofErr w:type="spellStart"/>
+      <w:r>
+        <w:rPr>
+          <w:lang w:val="en-US"/>
+        </w:rPr>
+        <w:t>database_insertion_</w:t>
+      </w:r>
+      <w:proofErr w:type="gramStart"/>
+      <w:r>
+        <w:rPr>
+          <w:lang w:val="en-US"/>
+        </w:rPr>
+        <w:t>query</w:t>
+      </w:r>
+      <w:proofErr w:type="spellEnd"/>
+      <w:r>
+        <w:rPr>
+          <w:lang w:val="en-US"/>
+        </w:rPr>
+        <w:t>(</w:t>
+      </w:r>
+      <w:proofErr w:type="spellStart"/>
+      <w:proofErr w:type="gramEnd"/>
+      <w:r>
+        <w:rPr>
+          <w:lang w:val="en-US"/>
+        </w:rPr>
+        <w:t>db_connection</w:t>
+      </w:r>
+      <w:proofErr w:type="spellEnd"/>
+      <w:r>
+        <w:rPr>
+          <w:lang w:val="en-US"/>
+        </w:rPr>
+        <w:t>, users)</w:t>
+      </w:r>
+    </w:p>
+    <w:p>
+      <w:pPr>
+        <w:numPr>
+          <w:ilvl w:val="0"/>
+          <w:numId w:val="35"/>
+        </w:numPr>
+        <w:spacing w:before="60" w:after="60" w:line="312" w:lineRule="auto"/>
+        <w:rPr>
+          <w:lang w:val="en-US"/>
+        </w:rPr>
+      </w:pPr>
+      <w:r>
+        <w:rPr>
+          <w:lang w:val="en-US"/>
+        </w:rPr>
+        <w:t xml:space="preserve">Esta </w:t>
+      </w:r>
+      <w:proofErr w:type="spellStart"/>
+      <w:r>
+        <w:rPr>
+          <w:lang w:val="en-US"/>
+        </w:rPr>
+        <w:t>función</w:t>
+      </w:r>
+      <w:proofErr w:type="spellEnd"/>
+      <w:r>
+        <w:rPr>
+          <w:lang w:val="en-US"/>
+        </w:rPr>
+        <w:t xml:space="preserve"> </w:t>
+      </w:r>
+      <w:proofErr w:type="spellStart"/>
+      <w:r>
+        <w:rPr>
+          <w:lang w:val="en-US"/>
+        </w:rPr>
+        <w:t>debe</w:t>
+      </w:r>
+      <w:proofErr w:type="spellEnd"/>
+      <w:r>
+        <w:rPr>
+          <w:lang w:val="en-US"/>
+        </w:rPr>
+        <w:t>:</w:t>
+      </w:r>
+    </w:p>
+    <w:p>
+      <w:pPr>
+        <w:numPr>
+          <w:ilvl w:val="1"/>
+          <w:numId w:val="35"/>
+        </w:numPr>
+        <w:spacing w:before="60" w:after="60" w:line="312" w:lineRule="auto"/>
+      </w:pPr>
+      <w:r>
+        <w:t>Recibir una conexión a la base de datos y la lista de usuarios válidos.</w:t>
+      </w:r>
+    </w:p>
+    <w:p>
+      <w:pPr>
+        <w:numPr>
+          <w:ilvl w:val="1"/>
+          <w:numId w:val="35"/>
+        </w:numPr>
+        <w:spacing w:before="60" w:after="60" w:line="312" w:lineRule="auto"/>
+      </w:pPr>
+      <w:r>
+        <w:t>Crear un cursor para ejecutar consultas SQL.</w:t>
+      </w:r>
+    </w:p>
+    <w:p>
+      <w:pPr>
+        <w:numPr>
+          <w:ilvl w:val="1"/>
+          <w:numId w:val="35"/>
+        </w:numPr>
+        <w:spacing w:before="60" w:after="60" w:line="312" w:lineRule="auto"/>
+      </w:pPr>
+      <w:proofErr w:type="spellStart"/>
+      <w:r>
+        <w:t>Recorrer</w:t>
+      </w:r>
+      <w:proofErr w:type="spellEnd"/>
+      <w:r>
+        <w:t xml:space="preserve"> la </w:t>
+      </w:r>
+      <w:proofErr w:type="spellStart"/>
+      <w:r>
+        <w:t>lista</w:t>
+      </w:r>
+      <w:proofErr w:type="spellEnd"/>
+      <w:r>
+        <w:t xml:space="preserve"> users.</w:t>
+      </w:r>
+    </w:p>
+    <w:p>
+      <w:pPr>
+        <w:numPr>
+          <w:ilvl w:val="1"/>
+          <w:numId w:val="35"/>
+        </w:numPr>
+        <w:spacing w:before="60" w:after="60" w:line="312" w:lineRule="auto"/>
+      </w:pPr>
+      <w:r>
+        <w:t xml:space="preserve">Insertar cada usuario en la tabla </w:t>
+      </w:r>
+      <w:proofErr w:type="spellStart"/>
+      <w:r>
+        <w:t>users</w:t>
+      </w:r>
+      <w:proofErr w:type="spellEnd"/>
+      <w:r>
+        <w:t>.</w:t>
+      </w:r>
+    </w:p>
+    <w:p>
+      <w:pPr>
+        <w:numPr>
+          <w:ilvl w:val="1"/>
+          <w:numId w:val="35"/>
+        </w:numPr>
+        <w:spacing w:before="60" w:after="60" w:line="312" w:lineRule="auto"/>
+      </w:pPr>
+      <w:r>
+        <w:t xml:space="preserve">Guardar los cambios en la base de datos mediante </w:t>
+      </w:r>
+      <w:proofErr w:type="spellStart"/>
+      <w:r>
+        <w:t>commit</w:t>
+      </w:r>
+      <w:proofErr w:type="spellEnd"/>
+      <w:r>
+        <w:t>.</w:t>
+      </w:r>
+    </w:p>
+    <w:p>
+      <w:pPr>
+        <w:numPr>
+          <w:ilvl w:val="1"/>
+          <w:numId w:val="35"/>
+        </w:numPr>
+        <w:spacing w:before="60" w:after="60" w:line="312" w:lineRule="auto"/>
+      </w:pPr>
+      <w:proofErr w:type="spellStart"/>
+      <w:r>
+        <w:t>Cerrar</w:t>
+      </w:r>
+      <w:proofErr w:type="spellEnd"/>
+      <w:r>
+        <w:t xml:space="preserve"> </w:t>
+      </w:r>
+      <w:proofErr w:type="spellStart"/>
+      <w:r>
+        <w:t>el</w:t>
+      </w:r>
+      <w:proofErr w:type="spellEnd"/>
+      <w:r>
+        <w:t xml:space="preserve"> cursor.</w:t>
+      </w:r>
+    </w:p>
+    <w:p>
+      <w:pPr>
+        <w:numPr>
+          <w:ilvl w:val="1"/>
+          <w:numId w:val="35"/>
+        </w:numPr>
+        <w:spacing w:before="60" w:after="60" w:line="312" w:lineRule="auto"/>
+      </w:pPr>
+      <w:r>
+        <w:t>Cerrar la conexión con la base de datos.</w:t>
+      </w:r>
+    </w:p>
+    <w:p>
+      <w:pPr>
+        <w:spacing w:before="0" w:after="200" w:line="276" w:lineRule="auto"/>
+        <w:ind w:left="924" w:hanging="357"/>
+        <w:rPr>
+          <w:b/>
+          <w:bCs/>
+        </w:rPr>
+      </w:pPr>
+      <w:r>
+        <w:rPr>
+          <w:b/>
+          <w:bCs/>
+        </w:rPr>
+        <w:br w:type="page"/>
+      </w:r>
+    </w:p>
+    <w:p>
+      <w:pPr>
+        <w:numPr>
+          <w:ilvl w:val="0"/>
+          <w:numId w:val="35"/>
+        </w:numPr>
+        <w:spacing w:before="60" w:after="60" w:line="312" w:lineRule="auto"/>
+        <w:rPr>
+          <w:b/>
+          <w:bCs/>
+        </w:rPr>
+      </w:pPr>
+      <w:r>
+        <w:rPr>
+          <w:b/>
+          <w:bCs/>
+        </w:rPr>
+        <w:lastRenderedPageBreak/>
+        <w:t>La conexión e inicio de la base de datos la tienen que hacer a través d</w:t>
+      </w:r>
+      <w:r>
+        <w:rPr>
+          <w:b/>
+          <w:bCs/>
+        </w:rPr>
+        <w:t>e un</w:t>
+      </w:r>
+      <w:r>
+        <w:rPr>
+          <w:b/>
+          <w:bCs/>
+        </w:rPr>
+        <w:t xml:space="preserve"> contenedor Docker, tienen que iniciar la ejecución del contenedor y comprobar la conexión con la base de datos PostgreSQL</w:t>
+      </w:r>
+    </w:p>
+    <w:p>
+      <w:pPr>
+        <w:spacing w:before="60" w:after="60" w:line="312" w:lineRule="auto"/>
+        <w:rPr>
+          <w:lang w:val="en-US"/>
+        </w:rPr>
+      </w:pPr>
+      <w:r>
+        <w:rPr>
+          <w:lang w:val="en-US"/>
+        </w:rPr>
+        <w:t>Docker string:</w:t>
+      </w:r>
+    </w:p>
+    <w:p>
+      <w:pPr>
+        <w:spacing w:before="60" w:after="60" w:line="312" w:lineRule="auto"/>
+        <w:rPr>
+          <w:b/>
+          <w:bCs/>
+          <w:lang w:val="en-US"/>
+        </w:rPr>
+      </w:pPr>
+      <w:r>
+        <w:rPr>
+          <w:b/>
+          <w:bCs/>
+          <w:lang w:val="en-US"/>
+        </w:rPr>
+        <w:t xml:space="preserve">docker run -d -p 5432:5432 --name </w:t>
+      </w:r>
+      <w:r>
+        <w:rPr>
+          <w:b/>
+          <w:bCs/>
+          <w:lang w:val="en-US"/>
+        </w:rPr>
+        <w:t>proyecto0</w:t>
+      </w:r>
+      <w:r>
+        <w:rPr>
+          <w:b/>
+          <w:bCs/>
+          <w:lang w:val="en-US"/>
+        </w:rPr>
+        <w:t xml:space="preserve"> -e POSTGRES_PASSWORD=1234 </w:t>
+      </w:r>
+      <w:proofErr w:type="spellStart"/>
+      <w:r>
+        <w:rPr>
+          <w:b/>
+          <w:bCs/>
+          <w:lang w:val="en-US"/>
+        </w:rPr>
+        <w:t>postgre</w:t>
+      </w:r>
+      <w:r>
+        <w:rPr>
+          <w:b/>
+          <w:bCs/>
+          <w:lang w:val="en-US"/>
+        </w:rPr>
+        <w:t>s</w:t>
+      </w:r>
+      <w:proofErr w:type="spellEnd"/>
+    </w:p>
+    <w:p>
+      <w:pPr>
+        <w:spacing w:before="60" w:after="60" w:line="312" w:lineRule="auto"/>
+        <w:rPr>
+          <w:lang w:val="en-US"/>
+        </w:rPr>
+      </w:pPr>
+      <w:r>
+        <w:rPr>
+          <w:lang w:val="en-US"/>
+        </w:rPr>
+        <w:t xml:space="preserve">SQL </w:t>
+      </w:r>
+      <w:proofErr w:type="spellStart"/>
+      <w:r>
+        <w:rPr>
+          <w:lang w:val="en-US"/>
+        </w:rPr>
+        <w:t>db</w:t>
+      </w:r>
+      <w:proofErr w:type="spellEnd"/>
+      <w:r>
+        <w:rPr>
+          <w:lang w:val="en-US"/>
+        </w:rPr>
+        <w:t xml:space="preserve"> queries:</w:t>
+      </w:r>
+    </w:p>
+    <w:p>
+      <w:pPr>
+        <w:spacing w:before="60" w:after="60" w:line="312" w:lineRule="auto"/>
+        <w:rPr>
+          <w:lang w:val="en-US"/>
+        </w:rPr>
+      </w:pPr>
+      <w:r>
+        <w:rPr>
+          <w:lang w:val="en-US"/>
+        </w:rPr>
+        <w:t>CREATE TABLE users (</w:t>
+      </w:r>
+    </w:p>
+    <w:p>
+      <w:pPr>
+        <w:spacing w:before="60" w:after="60" w:line="312" w:lineRule="auto"/>
+        <w:rPr>
+          <w:lang w:val="en-US"/>
+        </w:rPr>
+      </w:pPr>
+      <w:r>
+        <w:rPr>
+          <w:lang w:val="en-US"/>
+        </w:rPr>
+        <w:t xml:space="preserve">    id SERIAL PRIMARY KEY,</w:t>
+      </w:r>
+    </w:p>
+    <w:p>
+      <w:pPr>
+        <w:spacing w:before="60" w:after="60" w:line="312" w:lineRule="auto"/>
+        <w:rPr>
+          <w:lang w:val="en-US"/>
+        </w:rPr>
+      </w:pPr>
+      <w:r>
+        <w:rPr>
+          <w:lang w:val="en-US"/>
+        </w:rPr>
+        <w:t xml:space="preserve">    name </w:t>
+      </w:r>
+      <w:proofErr w:type="gramStart"/>
+      <w:r>
+        <w:rPr>
+          <w:lang w:val="en-US"/>
+        </w:rPr>
+        <w:t>VARCHAR(</w:t>
+      </w:r>
+      <w:proofErr w:type="gramEnd"/>
+      <w:r>
+        <w:rPr>
+          <w:lang w:val="en-US"/>
+        </w:rPr>
+        <w:t>50) NOT NULL,</w:t>
+      </w:r>
+    </w:p>
+    <w:p>
+      <w:pPr>
+        <w:spacing w:before="60" w:after="60" w:line="312" w:lineRule="auto"/>
+        <w:rPr>
+          <w:lang w:val="en-US"/>
+        </w:rPr>
+      </w:pPr>
+      <w:r>
+        <w:rPr>
+          <w:lang w:val="en-US"/>
+        </w:rPr>
+        <w:t xml:space="preserve">    surname </w:t>
+      </w:r>
+      <w:proofErr w:type="gramStart"/>
+      <w:r>
+        <w:rPr>
+          <w:lang w:val="en-US"/>
+        </w:rPr>
+        <w:t>VARCHAR(</w:t>
+      </w:r>
+      <w:proofErr w:type="gramEnd"/>
+      <w:r>
+        <w:rPr>
+          <w:lang w:val="en-US"/>
+        </w:rPr>
+        <w:t>50) NOT NULL,</w:t>
+      </w:r>
+    </w:p>
+    <w:p>
+      <w:pPr>
+        <w:spacing w:before="60" w:after="60" w:line="312" w:lineRule="auto"/>
+        <w:rPr>
+          <w:lang w:val="en-US"/>
+        </w:rPr>
+      </w:pPr>
+      <w:r>
+        <w:rPr>
+          <w:lang w:val="en-US"/>
+        </w:rPr>
+        <w:t xml:space="preserve">    email </w:t>
+      </w:r>
+      <w:proofErr w:type="gramStart"/>
+      <w:r>
+        <w:rPr>
+          <w:lang w:val="en-US"/>
+        </w:rPr>
+        <w:t>VARCHAR(</w:t>
+      </w:r>
+      <w:proofErr w:type="gramEnd"/>
+      <w:r>
+        <w:rPr>
+          <w:lang w:val="en-US"/>
+        </w:rPr>
+        <w:t>255) NOT NULL,</w:t>
+      </w:r>
+    </w:p>
+    <w:p>
+      <w:pPr>
+        <w:spacing w:before="60" w:after="60" w:line="312" w:lineRule="auto"/>
+        <w:rPr>
+          <w:lang w:val="en-US"/>
+        </w:rPr>
+      </w:pPr>
+      <w:r>
+        <w:rPr>
+          <w:lang w:val="en-US"/>
+        </w:rPr>
+        <w:t xml:space="preserve">    genre </w:t>
+      </w:r>
+      <w:proofErr w:type="gramStart"/>
+      <w:r>
+        <w:rPr>
+          <w:lang w:val="en-US"/>
+        </w:rPr>
+        <w:t>VARCHAR(</w:t>
+      </w:r>
+      <w:proofErr w:type="gramEnd"/>
+      <w:r>
+        <w:rPr>
+          <w:lang w:val="en-US"/>
+        </w:rPr>
+        <w:t>20),</w:t>
+      </w:r>
+    </w:p>
+    <w:p>
+      <w:pPr>
+        <w:spacing w:before="60" w:after="60" w:line="312" w:lineRule="auto"/>
+        <w:rPr>
+          <w:lang w:val="en-US"/>
+        </w:rPr>
+      </w:pPr>
+      <w:r>
+        <w:rPr>
+          <w:lang w:val="en-US"/>
+        </w:rPr>
+        <w:t xml:space="preserve">    birth DATE,</w:t>
+      </w:r>
+    </w:p>
+    <w:p>
+      <w:pPr>
+        <w:spacing w:before="60" w:after="60" w:line="312" w:lineRule="auto"/>
+        <w:rPr>
+          <w:lang w:val="en-US"/>
+        </w:rPr>
+      </w:pPr>
+      <w:r>
+        <w:rPr>
+          <w:lang w:val="en-US"/>
+        </w:rPr>
+        <w:t xml:space="preserve">    phone </w:t>
+      </w:r>
+      <w:proofErr w:type="gramStart"/>
+      <w:r>
+        <w:rPr>
+          <w:lang w:val="en-US"/>
+        </w:rPr>
+        <w:t>VARCHAR(</w:t>
+      </w:r>
+      <w:proofErr w:type="gramEnd"/>
+      <w:r>
+        <w:rPr>
+          <w:lang w:val="en-US"/>
+        </w:rPr>
+        <w:t>20),</w:t>
+      </w:r>
+    </w:p>
+    <w:p>
+      <w:pPr>
+        <w:spacing w:before="60" w:after="60" w:line="312" w:lineRule="auto"/>
+        <w:rPr>
+          <w:lang w:val="en-US"/>
+        </w:rPr>
+      </w:pPr>
+      <w:r>
+        <w:rPr>
+          <w:lang w:val="en-US"/>
+        </w:rPr>
+        <w:t xml:space="preserve">    country </w:t>
+      </w:r>
+      <w:proofErr w:type="gramStart"/>
+      <w:r>
+        <w:rPr>
+          <w:lang w:val="en-US"/>
+        </w:rPr>
+        <w:t>VARCHAR(</w:t>
+      </w:r>
+      <w:proofErr w:type="gramEnd"/>
+      <w:r>
+        <w:rPr>
+          <w:lang w:val="en-US"/>
+        </w:rPr>
+        <w:t>50),</w:t>
+      </w:r>
+    </w:p>
+    <w:p>
+      <w:pPr>
+        <w:spacing w:before="60" w:after="60" w:line="312" w:lineRule="auto"/>
+        <w:rPr>
+          <w:lang w:val="en-US"/>
+        </w:rPr>
+      </w:pPr>
+      <w:r>
+        <w:rPr>
+          <w:lang w:val="en-US"/>
+        </w:rPr>
+        <w:t xml:space="preserve">    city </w:t>
+      </w:r>
+      <w:proofErr w:type="gramStart"/>
+      <w:r>
+        <w:rPr>
+          <w:lang w:val="en-US"/>
+        </w:rPr>
+        <w:t>VARCHAR(</w:t>
+      </w:r>
+      <w:proofErr w:type="gramEnd"/>
+      <w:r>
+        <w:rPr>
+          <w:lang w:val="en-US"/>
+        </w:rPr>
+        <w:t>50),</w:t>
+      </w:r>
+    </w:p>
+    <w:p>
+      <w:pPr>
+        <w:spacing w:before="60" w:after="60" w:line="312" w:lineRule="auto"/>
+        <w:rPr>
+          <w:lang w:val="en-US"/>
+        </w:rPr>
+      </w:pPr>
+      <w:r>
+        <w:rPr>
+          <w:lang w:val="en-US"/>
+        </w:rPr>
+        <w:t xml:space="preserve">    state </w:t>
+      </w:r>
+      <w:proofErr w:type="gramStart"/>
+      <w:r>
+        <w:rPr>
+          <w:lang w:val="en-US"/>
+        </w:rPr>
+        <w:t>VARCHAR(</w:t>
+      </w:r>
+      <w:proofErr w:type="gramEnd"/>
+      <w:r>
+        <w:rPr>
+          <w:lang w:val="en-US"/>
+        </w:rPr>
+        <w:t>50)</w:t>
+      </w:r>
+    </w:p>
+    <w:p>
+      <w:pPr>
+        <w:spacing w:before="60" w:after="60" w:line="312" w:lineRule="auto"/>
+        <w:rPr>
+          <w:lang w:val="en-US"/>
+        </w:rPr>
+      </w:pPr>
+      <w:r>
+        <w:rPr>
+          <w:lang w:val="en-US"/>
+        </w:rPr>
+        <w:t>);</w:t>
+      </w:r>
+    </w:p>
+    <w:p>
+      <w:pPr>
+        <w:spacing w:before="60" w:after="60" w:line="312" w:lineRule="auto"/>
+        <w:rPr>
+          <w:b/>
+          <w:bCs/>
+          <w:lang w:val="en-US"/>
+        </w:rPr>
+      </w:pPr>
+      <w:r>
+        <w:rPr>
+          <w:b/>
+          <w:bCs/>
+          <w:lang w:val="en-US"/>
+        </w:rPr>
+        <w:br w:type="page"/>
+      </w:r>
+    </w:p>
+    <w:p>
+      <w:pPr>
+        <w:spacing w:before="60" w:after="60" w:line="312" w:lineRule="auto"/>
+        <w:rPr>
+          <w:b/>
+          <w:bCs/>
+        </w:rPr>
+      </w:pPr>
+      <w:r>
+        <w:rPr>
+          <w:b/>
+          <w:bCs/>
+        </w:rPr>
+        <w:lastRenderedPageBreak/>
         <w:t>Condición de finalización</w:t>
       </w:r>
     </w:p>
@@ -1032,7 +2133,6 @@
           <w:numId w:val="36"/>
         </w:numPr>
         <w:spacing w:before="60" w:after="60" w:line="312" w:lineRule="auto"/>
-        <w:jc w:val="left"/>
       </w:pPr>
       <w:r>
         <w:t xml:space="preserve">Se crea la copia del CSV en </w:t>
@@ -1053,7 +2153,6 @@
           <w:numId w:val="36"/>
         </w:numPr>
         <w:spacing w:before="60" w:after="60" w:line="312" w:lineRule="auto"/>
-        <w:jc w:val="left"/>
       </w:pPr>
       <w:r>
         <w:t>Se ejecuta el script Python.</w:t>
@@ -1066,10 +2165,53 @@
           <w:numId w:val="36"/>
         </w:numPr>
         <w:spacing w:before="60" w:after="60" w:line="312" w:lineRule="auto"/>
-        <w:jc w:val="left"/>
       </w:pPr>
       <w:r>
         <w:t>Se generan los dos archivos de registro en logs.</w:t>
+      </w:r>
+    </w:p>
+    <w:p>
+      <w:pPr>
+        <w:numPr>
+          <w:ilvl w:val="0"/>
+          <w:numId w:val="36"/>
+        </w:numPr>
+        <w:spacing w:before="0" w:after="200" w:line="276" w:lineRule="auto"/>
+      </w:pPr>
+      <w:r>
+        <w:t xml:space="preserve">Se crean objetos </w:t>
+      </w:r>
+      <w:proofErr w:type="spellStart"/>
+      <w:r>
+        <w:t>User</w:t>
+      </w:r>
+      <w:proofErr w:type="spellEnd"/>
+      <w:r>
+        <w:t xml:space="preserve"> para las filas correctas.</w:t>
+      </w:r>
+    </w:p>
+    <w:p>
+      <w:pPr>
+        <w:numPr>
+          <w:ilvl w:val="0"/>
+          <w:numId w:val="36"/>
+        </w:numPr>
+        <w:spacing w:before="0" w:after="200" w:line="276" w:lineRule="auto"/>
+      </w:pPr>
+      <w:r>
+        <w:t>Solo se insertan en PostgreSQL los usuarios sin datos ausentes.</w:t>
+      </w:r>
+    </w:p>
+    <w:p>
+      <w:pPr>
+        <w:numPr>
+          <w:ilvl w:val="0"/>
+          <w:numId w:val="36"/>
+        </w:numPr>
+        <w:spacing w:before="0" w:after="200" w:line="276" w:lineRule="auto"/>
+      </w:pPr>
+      <w:r>
+        <w:t>Las filas rechazadas no se insertan en la base de datos.</w:t>
       </w:r>
     </w:p>
     <w:sectPr>
@@ -1851,6 +2993,155 @@
     </w:lvl>
   </w:abstractNum>
   <w:abstractNum w:abstractNumId="2" w15:restartNumberingAfterBreak="0">
+    <w:nsid w:val="05CB5CD0"/>
+    <w:multiLevelType w:val="multilevel"/>
+    <w:tmpl w:val="AB20594C"/>
+    <w:lvl w:ilvl="0">
+      <w:start w:val="1"/>
+      <w:numFmt w:val="bullet"/>
+      <w:lvlText w:val=""/>
+      <w:lvlJc w:val="left"/>
+      <w:pPr>
+        <w:tabs>
+          <w:tab w:val="num" w:pos="720"/>
+        </w:tabs>
+        <w:ind w:left="720" w:hanging="360"/>
+      </w:pPr>
+      <w:rPr>
+        <w:rFonts w:ascii="Symbol" w:hAnsi="Symbol" w:hint="default"/>
+        <w:sz w:val="20"/>
+      </w:rPr>
+    </w:lvl>
+    <w:lvl w:ilvl="1" w:tentative="1">
+      <w:start w:val="1"/>
+      <w:numFmt w:val="bullet"/>
+      <w:lvlText w:val="o"/>
+      <w:lvlJc w:val="left"/>
+      <w:pPr>
+        <w:tabs>
+          <w:tab w:val="num" w:pos="1440"/>
+        </w:tabs>
+        <w:ind w:left="1440" w:hanging="360"/>
+      </w:pPr>
+      <w:rPr>
+        <w:rFonts w:ascii="Courier New" w:hAnsi="Courier New" w:hint="default"/>
+        <w:sz w:val="20"/>
+      </w:rPr>
+    </w:lvl>
+    <w:lvl w:ilvl="2" w:tentative="1">
+      <w:start w:val="1"/>
+      <w:numFmt w:val="bullet"/>
+      <w:lvlText w:val=""/>
+      <w:lvlJc w:val="left"/>
+      <w:pPr>
+        <w:tabs>
+          <w:tab w:val="num" w:pos="2160"/>
+        </w:tabs>
+        <w:ind w:left="2160" w:hanging="360"/>
+      </w:pPr>
+      <w:rPr>
+        <w:rFonts w:ascii="Wingdings" w:hAnsi="Wingdings" w:hint="default"/>
+        <w:sz w:val="20"/>
+      </w:rPr>
+    </w:lvl>
+    <w:lvl w:ilvl="3" w:tentative="1">
+      <w:start w:val="1"/>
+      <w:numFmt w:val="bullet"/>
+      <w:lvlText w:val=""/>
+      <w:lvlJc w:val="left"/>
+      <w:pPr>
+        <w:tabs>
+          <w:tab w:val="num" w:pos="2880"/>
+        </w:tabs>
+        <w:ind w:left="2880" w:hanging="360"/>
+      </w:pPr>
+      <w:rPr>
+        <w:rFonts w:ascii="Wingdings" w:hAnsi="Wingdings" w:hint="default"/>
+        <w:sz w:val="20"/>
+      </w:rPr>
+    </w:lvl>
+    <w:lvl w:ilvl="4" w:tentative="1">
+      <w:start w:val="1"/>
+      <w:numFmt w:val="bullet"/>
+      <w:lvlText w:val=""/>
+      <w:lvlJc w:val="left"/>
+      <w:pPr>
+        <w:tabs>
+          <w:tab w:val="num" w:pos="3600"/>
+        </w:tabs>
+        <w:ind w:left="3600" w:hanging="360"/>
+      </w:pPr>
+      <w:rPr>
+        <w:rFonts w:ascii="Wingdings" w:hAnsi="Wingdings" w:hint="default"/>
+        <w:sz w:val="20"/>
+      </w:rPr>
+    </w:lvl>
+    <w:lvl w:ilvl="5" w:tentative="1">
+      <w:start w:val="1"/>
+      <w:numFmt w:val="bullet"/>
+      <w:lvlText w:val=""/>
+      <w:lvlJc w:val="left"/>
+      <w:pPr>
+        <w:tabs>
+          <w:tab w:val="num" w:pos="4320"/>
+        </w:tabs>
+        <w:ind w:left="4320" w:hanging="360"/>
+      </w:pPr>
+      <w:rPr>
+        <w:rFonts w:ascii="Wingdings" w:hAnsi="Wingdings" w:hint="default"/>
+        <w:sz w:val="20"/>
+      </w:rPr>
+    </w:lvl>
+    <w:lvl w:ilvl="6" w:tentative="1">
+      <w:start w:val="1"/>
+      <w:numFmt w:val="bullet"/>
+      <w:lvlText w:val=""/>
+      <w:lvlJc w:val="left"/>
+      <w:pPr>
+        <w:tabs>
+          <w:tab w:val="num" w:pos="5040"/>
+        </w:tabs>
+        <w:ind w:left="5040" w:hanging="360"/>
+      </w:pPr>
+      <w:rPr>
+        <w:rFonts w:ascii="Wingdings" w:hAnsi="Wingdings" w:hint="default"/>
+        <w:sz w:val="20"/>
+      </w:rPr>
+    </w:lvl>
+    <w:lvl w:ilvl="7" w:tentative="1">
+      <w:start w:val="1"/>
+      <w:numFmt w:val="bullet"/>
+      <w:lvlText w:val=""/>
+      <w:lvlJc w:val="left"/>
+      <w:pPr>
+        <w:tabs>
+          <w:tab w:val="num" w:pos="5760"/>
+        </w:tabs>
+        <w:ind w:left="5760" w:hanging="360"/>
+      </w:pPr>
+      <w:rPr>
+        <w:rFonts w:ascii="Wingdings" w:hAnsi="Wingdings" w:hint="default"/>
+        <w:sz w:val="20"/>
+      </w:rPr>
+    </w:lvl>
+    <w:lvl w:ilvl="8" w:tentative="1">
+      <w:start w:val="1"/>
+      <w:numFmt w:val="bullet"/>
+      <w:lvlText w:val=""/>
+      <w:lvlJc w:val="left"/>
+      <w:pPr>
+        <w:tabs>
+          <w:tab w:val="num" w:pos="6480"/>
+        </w:tabs>
+        <w:ind w:left="6480" w:hanging="360"/>
+      </w:pPr>
+      <w:rPr>
+        <w:rFonts w:ascii="Wingdings" w:hAnsi="Wingdings" w:hint="default"/>
+        <w:sz w:val="20"/>
+      </w:rPr>
+    </w:lvl>
+  </w:abstractNum>
+  <w:abstractNum w:abstractNumId="3" w15:restartNumberingAfterBreak="0">
     <w:nsid w:val="120D3167"/>
     <w:multiLevelType w:val="multilevel"/>
     <w:tmpl w:val="09CAEBBA"/>
@@ -1963,7 +3254,7 @@
       </w:pPr>
     </w:lvl>
   </w:abstractNum>
-  <w:abstractNum w:abstractNumId="3" w15:restartNumberingAfterBreak="0">
+  <w:abstractNum w:abstractNumId="4" w15:restartNumberingAfterBreak="0">
     <w:nsid w:val="19627253"/>
     <w:multiLevelType w:val="hybridMultilevel"/>
     <w:tmpl w:val="8D5C9B60"/>
@@ -2075,7 +3366,7 @@
       </w:rPr>
     </w:lvl>
   </w:abstractNum>
-  <w:abstractNum w:abstractNumId="4" w15:restartNumberingAfterBreak="0">
+  <w:abstractNum w:abstractNumId="5" w15:restartNumberingAfterBreak="0">
     <w:nsid w:val="1C603616"/>
     <w:multiLevelType w:val="hybridMultilevel"/>
     <w:tmpl w:val="58F29D64"/>
@@ -2188,7 +3479,120 @@
       </w:rPr>
     </w:lvl>
   </w:abstractNum>
-  <w:abstractNum w:abstractNumId="5" w15:restartNumberingAfterBreak="0">
+  <w:abstractNum w:abstractNumId="6" w15:restartNumberingAfterBreak="0">
+    <w:nsid w:val="23B062BD"/>
+    <w:multiLevelType w:val="multilevel"/>
+    <w:tmpl w:val="6A549360"/>
+    <w:lvl w:ilvl="0">
+      <w:start w:val="1"/>
+      <w:numFmt w:val="decimal"/>
+      <w:lvlText w:val="%1."/>
+      <w:lvlJc w:val="left"/>
+      <w:pPr>
+        <w:tabs>
+          <w:tab w:val="num" w:pos="720"/>
+        </w:tabs>
+        <w:ind w:left="720" w:hanging="360"/>
+      </w:pPr>
+    </w:lvl>
+    <w:lvl w:ilvl="1" w:tentative="1">
+      <w:start w:val="1"/>
+      <w:numFmt w:val="decimal"/>
+      <w:lvlText w:val="%2."/>
+      <w:lvlJc w:val="left"/>
+      <w:pPr>
+        <w:tabs>
+          <w:tab w:val="num" w:pos="1440"/>
+        </w:tabs>
+        <w:ind w:left="1440" w:hanging="360"/>
+      </w:pPr>
+    </w:lvl>
+    <w:lvl w:ilvl="2" w:tentative="1">
+      <w:start w:val="1"/>
+      <w:numFmt w:val="decimal"/>
+      <w:lvlText w:val="%3."/>
+      <w:lvlJc w:val="left"/>
+      <w:pPr>
+        <w:tabs>
+          <w:tab w:val="num" w:pos="2160"/>
+        </w:tabs>
+        <w:ind w:left="2160" w:hanging="360"/>
+      </w:pPr>
+    </w:lvl>
+    <w:lvl w:ilvl="3" w:tentative="1">
+      <w:start w:val="1"/>
+      <w:numFmt w:val="decimal"/>
+      <w:lvlText w:val="%4."/>
+      <w:lvlJc w:val="left"/>
+      <w:pPr>
+        <w:tabs>
+          <w:tab w:val="num" w:pos="2880"/>
+        </w:tabs>
+        <w:ind w:left="2880" w:hanging="360"/>
+      </w:pPr>
+    </w:lvl>
+    <w:lvl w:ilvl="4" w:tentative="1">
+      <w:start w:val="1"/>
+      <w:numFmt w:val="decimal"/>
+      <w:lvlText w:val="%5."/>
+      <w:lvlJc w:val="left"/>
+      <w:pPr>
+        <w:tabs>
+          <w:tab w:val="num" w:pos="3600"/>
+        </w:tabs>
+        <w:ind w:left="3600" w:hanging="360"/>
+      </w:pPr>
+    </w:lvl>
+    <w:lvl w:ilvl="5" w:tentative="1">
+      <w:start w:val="1"/>
+      <w:numFmt w:val="decimal"/>
+      <w:lvlText w:val="%6."/>
+      <w:lvlJc w:val="left"/>
+      <w:pPr>
+        <w:tabs>
+          <w:tab w:val="num" w:pos="4320"/>
+        </w:tabs>
+        <w:ind w:left="4320" w:hanging="360"/>
+      </w:pPr>
+    </w:lvl>
+    <w:lvl w:ilvl="6" w:tentative="1">
+      <w:start w:val="1"/>
+      <w:numFmt w:val="decimal"/>
+      <w:lvlText w:val="%7."/>
+      <w:lvlJc w:val="left"/>
+      <w:pPr>
+        <w:tabs>
+          <w:tab w:val="num" w:pos="5040"/>
+        </w:tabs>
+        <w:ind w:left="5040" w:hanging="360"/>
+      </w:pPr>
+    </w:lvl>
+    <w:lvl w:ilvl="7" w:tentative="1">
+      <w:start w:val="1"/>
+      <w:numFmt w:val="decimal"/>
+      <w:lvlText w:val="%8."/>
+      <w:lvlJc w:val="left"/>
+      <w:pPr>
+        <w:tabs>
+          <w:tab w:val="num" w:pos="5760"/>
+        </w:tabs>
+        <w:ind w:left="5760" w:hanging="360"/>
+      </w:pPr>
+    </w:lvl>
+    <w:lvl w:ilvl="8" w:tentative="1">
+      <w:start w:val="1"/>
+      <w:numFmt w:val="decimal"/>
+      <w:lvlText w:val="%9."/>
+      <w:lvlJc w:val="left"/>
+      <w:pPr>
+        <w:tabs>
+          <w:tab w:val="num" w:pos="6480"/>
+        </w:tabs>
+        <w:ind w:left="6480" w:hanging="360"/>
+      </w:pPr>
+    </w:lvl>
+  </w:abstractNum>
+  <w:abstractNum w:abstractNumId="7" w15:restartNumberingAfterBreak="0">
     <w:nsid w:val="26DF6DC7"/>
     <w:multiLevelType w:val="hybridMultilevel"/>
     <w:tmpl w:val="96664CC4"/>
@@ -2301,7 +3705,7 @@
       </w:rPr>
     </w:lvl>
   </w:abstractNum>
-  <w:abstractNum w:abstractNumId="6" w15:restartNumberingAfterBreak="0">
+  <w:abstractNum w:abstractNumId="8" w15:restartNumberingAfterBreak="0">
     <w:nsid w:val="26ED7909"/>
     <w:multiLevelType w:val="multilevel"/>
     <w:tmpl w:val="1ECE3050"/>
@@ -2414,7 +3818,7 @@
       </w:pPr>
     </w:lvl>
   </w:abstractNum>
-  <w:abstractNum w:abstractNumId="7" w15:restartNumberingAfterBreak="0">
+  <w:abstractNum w:abstractNumId="9" w15:restartNumberingAfterBreak="0">
     <w:nsid w:val="27436460"/>
     <w:multiLevelType w:val="hybridMultilevel"/>
     <w:tmpl w:val="0374D724"/>
@@ -2500,7 +3904,156 @@
       </w:pPr>
     </w:lvl>
   </w:abstractNum>
-  <w:abstractNum w:abstractNumId="8" w15:restartNumberingAfterBreak="0">
+  <w:abstractNum w:abstractNumId="10" w15:restartNumberingAfterBreak="0">
+    <w:nsid w:val="283063EB"/>
+    <w:multiLevelType w:val="multilevel"/>
+    <w:tmpl w:val="062AC938"/>
+    <w:lvl w:ilvl="0">
+      <w:start w:val="1"/>
+      <w:numFmt w:val="bullet"/>
+      <w:lvlText w:val=""/>
+      <w:lvlJc w:val="left"/>
+      <w:pPr>
+        <w:tabs>
+          <w:tab w:val="num" w:pos="720"/>
+        </w:tabs>
+        <w:ind w:left="720" w:hanging="360"/>
+      </w:pPr>
+      <w:rPr>
+        <w:rFonts w:ascii="Symbol" w:hAnsi="Symbol" w:hint="default"/>
+        <w:sz w:val="20"/>
+      </w:rPr>
+    </w:lvl>
+    <w:lvl w:ilvl="1" w:tentative="1">
+      <w:start w:val="1"/>
+      <w:numFmt w:val="bullet"/>
+      <w:lvlText w:val="o"/>
+      <w:lvlJc w:val="left"/>
+      <w:pPr>
+        <w:tabs>
+          <w:tab w:val="num" w:pos="1440"/>
+        </w:tabs>
+        <w:ind w:left="1440" w:hanging="360"/>
+      </w:pPr>
+      <w:rPr>
+        <w:rFonts w:ascii="Courier New" w:hAnsi="Courier New" w:hint="default"/>
+        <w:sz w:val="20"/>
+      </w:rPr>
+    </w:lvl>
+    <w:lvl w:ilvl="2" w:tentative="1">
+      <w:start w:val="1"/>
+      <w:numFmt w:val="bullet"/>
+      <w:lvlText w:val=""/>
+      <w:lvlJc w:val="left"/>
+      <w:pPr>
+        <w:tabs>
+          <w:tab w:val="num" w:pos="2160"/>
+        </w:tabs>
+        <w:ind w:left="2160" w:hanging="360"/>
+      </w:pPr>
+      <w:rPr>
+        <w:rFonts w:ascii="Wingdings" w:hAnsi="Wingdings" w:hint="default"/>
+        <w:sz w:val="20"/>
+      </w:rPr>
+    </w:lvl>
+    <w:lvl w:ilvl="3" w:tentative="1">
+      <w:start w:val="1"/>
+      <w:numFmt w:val="bullet"/>
+      <w:lvlText w:val=""/>
+      <w:lvlJc w:val="left"/>
+      <w:pPr>
+        <w:tabs>
+          <w:tab w:val="num" w:pos="2880"/>
+        </w:tabs>
+        <w:ind w:left="2880" w:hanging="360"/>
+      </w:pPr>
+      <w:rPr>
+        <w:rFonts w:ascii="Wingdings" w:hAnsi="Wingdings" w:hint="default"/>
+        <w:sz w:val="20"/>
+      </w:rPr>
+    </w:lvl>
+    <w:lvl w:ilvl="4" w:tentative="1">
+      <w:start w:val="1"/>
+      <w:numFmt w:val="bullet"/>
+      <w:lvlText w:val=""/>
+      <w:lvlJc w:val="left"/>
+      <w:pPr>
+        <w:tabs>
+          <w:tab w:val="num" w:pos="3600"/>
+        </w:tabs>
+        <w:ind w:left="3600" w:hanging="360"/>
+      </w:pPr>
+      <w:rPr>
+        <w:rFonts w:ascii="Wingdings" w:hAnsi="Wingdings" w:hint="default"/>
+        <w:sz w:val="20"/>
+      </w:rPr>
+    </w:lvl>
+    <w:lvl w:ilvl="5" w:tentative="1">
+      <w:start w:val="1"/>
+      <w:numFmt w:val="bullet"/>
+      <w:lvlText w:val=""/>
+      <w:lvlJc w:val="left"/>
+      <w:pPr>
+        <w:tabs>
+          <w:tab w:val="num" w:pos="4320"/>
+        </w:tabs>
+        <w:ind w:left="4320" w:hanging="360"/>
+      </w:pPr>
+      <w:rPr>
+        <w:rFonts w:ascii="Wingdings" w:hAnsi="Wingdings" w:hint="default"/>
+        <w:sz w:val="20"/>
+      </w:rPr>
+    </w:lvl>
+    <w:lvl w:ilvl="6" w:tentative="1">
+      <w:start w:val="1"/>
+      <w:numFmt w:val="bullet"/>
+      <w:lvlText w:val=""/>
+      <w:lvlJc w:val="left"/>
+      <w:pPr>
+        <w:tabs>
+          <w:tab w:val="num" w:pos="5040"/>
+        </w:tabs>
+        <w:ind w:left="5040" w:hanging="360"/>
+      </w:pPr>
+      <w:rPr>
+        <w:rFonts w:ascii="Wingdings" w:hAnsi="Wingdings" w:hint="default"/>
+        <w:sz w:val="20"/>
+      </w:rPr>
+    </w:lvl>
+    <w:lvl w:ilvl="7" w:tentative="1">
+      <w:start w:val="1"/>
+      <w:numFmt w:val="bullet"/>
+      <w:lvlText w:val=""/>
+      <w:lvlJc w:val="left"/>
+      <w:pPr>
+        <w:tabs>
+          <w:tab w:val="num" w:pos="5760"/>
+        </w:tabs>
+        <w:ind w:left="5760" w:hanging="360"/>
+      </w:pPr>
+      <w:rPr>
+        <w:rFonts w:ascii="Wingdings" w:hAnsi="Wingdings" w:hint="default"/>
+        <w:sz w:val="20"/>
+      </w:rPr>
+    </w:lvl>
+    <w:lvl w:ilvl="8" w:tentative="1">
+      <w:start w:val="1"/>
+      <w:numFmt w:val="bullet"/>
+      <w:lvlText w:val=""/>
+      <w:lvlJc w:val="left"/>
+      <w:pPr>
+        <w:tabs>
+          <w:tab w:val="num" w:pos="6480"/>
+        </w:tabs>
+        <w:ind w:left="6480" w:hanging="360"/>
+      </w:pPr>
+      <w:rPr>
+        <w:rFonts w:ascii="Wingdings" w:hAnsi="Wingdings" w:hint="default"/>
+        <w:sz w:val="20"/>
+      </w:rPr>
+    </w:lvl>
+  </w:abstractNum>
+  <w:abstractNum w:abstractNumId="11" w15:restartNumberingAfterBreak="0">
     <w:nsid w:val="2FBE3B4A"/>
     <w:multiLevelType w:val="multilevel"/>
     <w:tmpl w:val="94C4B710"/>
@@ -2613,7 +4166,7 @@
       </w:pPr>
     </w:lvl>
   </w:abstractNum>
-  <w:abstractNum w:abstractNumId="9" w15:restartNumberingAfterBreak="0">
+  <w:abstractNum w:abstractNumId="12" w15:restartNumberingAfterBreak="0">
     <w:nsid w:val="31AC5C81"/>
     <w:multiLevelType w:val="hybridMultilevel"/>
     <w:tmpl w:val="2174D1A0"/>
@@ -2725,7 +4278,7 @@
       </w:rPr>
     </w:lvl>
   </w:abstractNum>
-  <w:abstractNum w:abstractNumId="10" w15:restartNumberingAfterBreak="0">
+  <w:abstractNum w:abstractNumId="13" w15:restartNumberingAfterBreak="0">
     <w:nsid w:val="340865B7"/>
     <w:multiLevelType w:val="multilevel"/>
     <w:tmpl w:val="B0C4DAFA"/>
@@ -2874,7 +4427,7 @@
       </w:rPr>
     </w:lvl>
   </w:abstractNum>
-  <w:abstractNum w:abstractNumId="11" w15:restartNumberingAfterBreak="0">
+  <w:abstractNum w:abstractNumId="14" w15:restartNumberingAfterBreak="0">
     <w:nsid w:val="360529A0"/>
     <w:multiLevelType w:val="multilevel"/>
     <w:tmpl w:val="4E9AE99E"/>
@@ -3023,7 +4576,7 @@
       </w:rPr>
     </w:lvl>
   </w:abstractNum>
-  <w:abstractNum w:abstractNumId="12" w15:restartNumberingAfterBreak="0">
+  <w:abstractNum w:abstractNumId="15" w15:restartNumberingAfterBreak="0">
     <w:nsid w:val="3A1028F0"/>
     <w:multiLevelType w:val="multilevel"/>
     <w:tmpl w:val="95C095AE"/>
@@ -3140,7 +4693,7 @@
       </w:pPr>
     </w:lvl>
   </w:abstractNum>
-  <w:abstractNum w:abstractNumId="13" w15:restartNumberingAfterBreak="0">
+  <w:abstractNum w:abstractNumId="16" w15:restartNumberingAfterBreak="0">
     <w:nsid w:val="3A4D6D56"/>
     <w:multiLevelType w:val="hybridMultilevel"/>
     <w:tmpl w:val="D8F48C08"/>
@@ -3252,7 +4805,7 @@
       </w:rPr>
     </w:lvl>
   </w:abstractNum>
-  <w:abstractNum w:abstractNumId="14" w15:restartNumberingAfterBreak="0">
+  <w:abstractNum w:abstractNumId="17" w15:restartNumberingAfterBreak="0">
     <w:nsid w:val="3C2802C2"/>
     <w:multiLevelType w:val="multilevel"/>
     <w:tmpl w:val="17BCF860"/>
@@ -3365,7 +4918,7 @@
       </w:pPr>
     </w:lvl>
   </w:abstractNum>
-  <w:abstractNum w:abstractNumId="15" w15:restartNumberingAfterBreak="0">
+  <w:abstractNum w:abstractNumId="18" w15:restartNumberingAfterBreak="0">
     <w:nsid w:val="3D2C729D"/>
     <w:multiLevelType w:val="hybridMultilevel"/>
     <w:tmpl w:val="73EA67F2"/>
@@ -3451,7 +5004,7 @@
       </w:pPr>
     </w:lvl>
   </w:abstractNum>
-  <w:abstractNum w:abstractNumId="16" w15:restartNumberingAfterBreak="0">
+  <w:abstractNum w:abstractNumId="19" w15:restartNumberingAfterBreak="0">
     <w:nsid w:val="41482E61"/>
     <w:multiLevelType w:val="hybridMultilevel"/>
     <w:tmpl w:val="137A85DE"/>
@@ -3563,7 +5116,7 @@
       </w:rPr>
     </w:lvl>
   </w:abstractNum>
-  <w:abstractNum w:abstractNumId="17" w15:restartNumberingAfterBreak="0">
+  <w:abstractNum w:abstractNumId="20" w15:restartNumberingAfterBreak="0">
     <w:nsid w:val="41FB0972"/>
     <w:multiLevelType w:val="hybridMultilevel"/>
     <w:tmpl w:val="CE0088D8"/>
@@ -3675,7 +5228,7 @@
       </w:rPr>
     </w:lvl>
   </w:abstractNum>
-  <w:abstractNum w:abstractNumId="18" w15:restartNumberingAfterBreak="0">
+  <w:abstractNum w:abstractNumId="21" w15:restartNumberingAfterBreak="0">
     <w:nsid w:val="42C82C1E"/>
     <w:multiLevelType w:val="multilevel"/>
     <w:tmpl w:val="5CB6362E"/>
@@ -3824,7 +5377,7 @@
       </w:rPr>
     </w:lvl>
   </w:abstractNum>
-  <w:abstractNum w:abstractNumId="19" w15:restartNumberingAfterBreak="0">
+  <w:abstractNum w:abstractNumId="22" w15:restartNumberingAfterBreak="0">
     <w:nsid w:val="438C0C48"/>
     <w:multiLevelType w:val="hybridMultilevel"/>
     <w:tmpl w:val="D5B4F1FA"/>
@@ -3936,7 +5489,7 @@
       </w:rPr>
     </w:lvl>
   </w:abstractNum>
-  <w:abstractNum w:abstractNumId="20" w15:restartNumberingAfterBreak="0">
+  <w:abstractNum w:abstractNumId="23" w15:restartNumberingAfterBreak="0">
     <w:nsid w:val="4D4B093E"/>
     <w:multiLevelType w:val="multilevel"/>
     <w:tmpl w:val="84AC30F0"/>
@@ -4050,7 +5603,7 @@
       </w:pPr>
     </w:lvl>
   </w:abstractNum>
-  <w:abstractNum w:abstractNumId="21" w15:restartNumberingAfterBreak="0">
+  <w:abstractNum w:abstractNumId="24" w15:restartNumberingAfterBreak="0">
     <w:nsid w:val="4D7B2E70"/>
     <w:multiLevelType w:val="hybridMultilevel"/>
     <w:tmpl w:val="81AAD34E"/>
@@ -4163,7 +5716,7 @@
       </w:rPr>
     </w:lvl>
   </w:abstractNum>
-  <w:abstractNum w:abstractNumId="22" w15:restartNumberingAfterBreak="0">
+  <w:abstractNum w:abstractNumId="25" w15:restartNumberingAfterBreak="0">
     <w:nsid w:val="51BD09F1"/>
     <w:multiLevelType w:val="hybridMultilevel"/>
     <w:tmpl w:val="282EB36E"/>
@@ -4249,7 +5802,7 @@
       </w:pPr>
     </w:lvl>
   </w:abstractNum>
-  <w:abstractNum w:abstractNumId="23" w15:restartNumberingAfterBreak="0">
+  <w:abstractNum w:abstractNumId="26" w15:restartNumberingAfterBreak="0">
     <w:nsid w:val="52DA3567"/>
     <w:multiLevelType w:val="hybridMultilevel"/>
     <w:tmpl w:val="DBEC6762"/>
@@ -4335,7 +5888,7 @@
       </w:pPr>
     </w:lvl>
   </w:abstractNum>
-  <w:abstractNum w:abstractNumId="24" w15:restartNumberingAfterBreak="0">
+  <w:abstractNum w:abstractNumId="27" w15:restartNumberingAfterBreak="0">
     <w:nsid w:val="58A334F1"/>
     <w:multiLevelType w:val="multilevel"/>
     <w:tmpl w:val="AAD651AE"/>
@@ -4448,7 +6001,7 @@
       </w:rPr>
     </w:lvl>
   </w:abstractNum>
-  <w:abstractNum w:abstractNumId="25" w15:restartNumberingAfterBreak="0">
+  <w:abstractNum w:abstractNumId="28" w15:restartNumberingAfterBreak="0">
     <w:nsid w:val="5CF322DF"/>
     <w:multiLevelType w:val="hybridMultilevel"/>
     <w:tmpl w:val="1A34B904"/>
@@ -4534,7 +6087,7 @@
       </w:pPr>
     </w:lvl>
   </w:abstractNum>
-  <w:abstractNum w:abstractNumId="26" w15:restartNumberingAfterBreak="0">
+  <w:abstractNum w:abstractNumId="29" w15:restartNumberingAfterBreak="0">
     <w:nsid w:val="630F0FB7"/>
     <w:multiLevelType w:val="hybridMultilevel"/>
     <w:tmpl w:val="34527804"/>
@@ -4647,7 +6200,7 @@
       </w:rPr>
     </w:lvl>
   </w:abstractNum>
-  <w:abstractNum w:abstractNumId="27" w15:restartNumberingAfterBreak="0">
+  <w:abstractNum w:abstractNumId="30" w15:restartNumberingAfterBreak="0">
     <w:nsid w:val="64223420"/>
     <w:multiLevelType w:val="hybridMultilevel"/>
     <w:tmpl w:val="C95C5C8E"/>
@@ -4760,7 +6313,7 @@
       </w:rPr>
     </w:lvl>
   </w:abstractNum>
-  <w:abstractNum w:abstractNumId="28" w15:restartNumberingAfterBreak="0">
+  <w:abstractNum w:abstractNumId="31" w15:restartNumberingAfterBreak="0">
     <w:nsid w:val="69757FEA"/>
     <w:multiLevelType w:val="multilevel"/>
     <w:tmpl w:val="29E0D5C4"/>
@@ -4909,7 +6462,7 @@
       </w:rPr>
     </w:lvl>
   </w:abstractNum>
-  <w:abstractNum w:abstractNumId="29" w15:restartNumberingAfterBreak="0">
+  <w:abstractNum w:abstractNumId="32" w15:restartNumberingAfterBreak="0">
     <w:nsid w:val="6FC80B65"/>
     <w:multiLevelType w:val="multilevel"/>
     <w:tmpl w:val="80D87FEE"/>
@@ -5058,7 +6611,7 @@
       </w:rPr>
     </w:lvl>
   </w:abstractNum>
-  <w:abstractNum w:abstractNumId="30" w15:restartNumberingAfterBreak="0">
+  <w:abstractNum w:abstractNumId="33" w15:restartNumberingAfterBreak="0">
     <w:nsid w:val="716C1B6C"/>
     <w:multiLevelType w:val="multilevel"/>
     <w:tmpl w:val="040A001F"/>
@@ -5144,7 +6697,120 @@
       </w:pPr>
     </w:lvl>
   </w:abstractNum>
-  <w:abstractNum w:abstractNumId="31" w15:restartNumberingAfterBreak="0">
+  <w:abstractNum w:abstractNumId="34" w15:restartNumberingAfterBreak="0">
+    <w:nsid w:val="71C02160"/>
+    <w:multiLevelType w:val="multilevel"/>
+    <w:tmpl w:val="3EB4EB64"/>
+    <w:lvl w:ilvl="0">
+      <w:start w:val="1"/>
+      <w:numFmt w:val="decimal"/>
+      <w:lvlText w:val="%1."/>
+      <w:lvlJc w:val="left"/>
+      <w:pPr>
+        <w:tabs>
+          <w:tab w:val="num" w:pos="720"/>
+        </w:tabs>
+        <w:ind w:left="720" w:hanging="360"/>
+      </w:pPr>
+    </w:lvl>
+    <w:lvl w:ilvl="1" w:tentative="1">
+      <w:start w:val="1"/>
+      <w:numFmt w:val="decimal"/>
+      <w:lvlText w:val="%2."/>
+      <w:lvlJc w:val="left"/>
+      <w:pPr>
+        <w:tabs>
+          <w:tab w:val="num" w:pos="1440"/>
+        </w:tabs>
+        <w:ind w:left="1440" w:hanging="360"/>
+      </w:pPr>
+    </w:lvl>
+    <w:lvl w:ilvl="2" w:tentative="1">
+      <w:start w:val="1"/>
+      <w:numFmt w:val="decimal"/>
+      <w:lvlText w:val="%3."/>
+      <w:lvlJc w:val="left"/>
+      <w:pPr>
+        <w:tabs>
+          <w:tab w:val="num" w:pos="2160"/>
+        </w:tabs>
+        <w:ind w:left="2160" w:hanging="360"/>
+      </w:pPr>
+    </w:lvl>
+    <w:lvl w:ilvl="3" w:tentative="1">
+      <w:start w:val="1"/>
+      <w:numFmt w:val="decimal"/>
+      <w:lvlText w:val="%4."/>
+      <w:lvlJc w:val="left"/>
+      <w:pPr>
+        <w:tabs>
+          <w:tab w:val="num" w:pos="2880"/>
+        </w:tabs>
+        <w:ind w:left="2880" w:hanging="360"/>
+      </w:pPr>
+    </w:lvl>
+    <w:lvl w:ilvl="4" w:tentative="1">
+      <w:start w:val="1"/>
+      <w:numFmt w:val="decimal"/>
+      <w:lvlText w:val="%5."/>
+      <w:lvlJc w:val="left"/>
+      <w:pPr>
+        <w:tabs>
+          <w:tab w:val="num" w:pos="3600"/>
+        </w:tabs>
+        <w:ind w:left="3600" w:hanging="360"/>
+      </w:pPr>
+    </w:lvl>
+    <w:lvl w:ilvl="5" w:tentative="1">
+      <w:start w:val="1"/>
+      <w:numFmt w:val="decimal"/>
+      <w:lvlText w:val="%6."/>
+      <w:lvlJc w:val="left"/>
+      <w:pPr>
+        <w:tabs>
+          <w:tab w:val="num" w:pos="4320"/>
+        </w:tabs>
+        <w:ind w:left="4320" w:hanging="360"/>
+      </w:pPr>
+    </w:lvl>
+    <w:lvl w:ilvl="6" w:tentative="1">
+      <w:start w:val="1"/>
+      <w:numFmt w:val="decimal"/>
+      <w:lvlText w:val="%7."/>
+      <w:lvlJc w:val="left"/>
+      <w:pPr>
+        <w:tabs>
+          <w:tab w:val="num" w:pos="5040"/>
+        </w:tabs>
+        <w:ind w:left="5040" w:hanging="360"/>
+      </w:pPr>
+    </w:lvl>
+    <w:lvl w:ilvl="7" w:tentative="1">
+      <w:start w:val="1"/>
+      <w:numFmt w:val="decimal"/>
+      <w:lvlText w:val="%8."/>
+      <w:lvlJc w:val="left"/>
+      <w:pPr>
+        <w:tabs>
+          <w:tab w:val="num" w:pos="5760"/>
+        </w:tabs>
+        <w:ind w:left="5760" w:hanging="360"/>
+      </w:pPr>
+    </w:lvl>
+    <w:lvl w:ilvl="8" w:tentative="1">
+      <w:start w:val="1"/>
+      <w:numFmt w:val="decimal"/>
+      <w:lvlText w:val="%9."/>
+      <w:lvlJc w:val="left"/>
+      <w:pPr>
+        <w:tabs>
+          <w:tab w:val="num" w:pos="6480"/>
+        </w:tabs>
+        <w:ind w:left="6480" w:hanging="360"/>
+      </w:pPr>
+    </w:lvl>
+  </w:abstractNum>
+  <w:abstractNum w:abstractNumId="35" w15:restartNumberingAfterBreak="0">
     <w:nsid w:val="72BB45FC"/>
     <w:multiLevelType w:val="multilevel"/>
     <w:tmpl w:val="040A001F"/>
@@ -5230,7 +6896,7 @@
       </w:pPr>
     </w:lvl>
   </w:abstractNum>
-  <w:abstractNum w:abstractNumId="32" w15:restartNumberingAfterBreak="0">
+  <w:abstractNum w:abstractNumId="36" w15:restartNumberingAfterBreak="0">
     <w:nsid w:val="73531AF4"/>
     <w:multiLevelType w:val="hybridMultilevel"/>
     <w:tmpl w:val="675805CE"/>
@@ -5343,7 +7009,7 @@
       </w:rPr>
     </w:lvl>
   </w:abstractNum>
-  <w:abstractNum w:abstractNumId="33" w15:restartNumberingAfterBreak="0">
+  <w:abstractNum w:abstractNumId="37" w15:restartNumberingAfterBreak="0">
     <w:nsid w:val="73BC3CC6"/>
     <w:multiLevelType w:val="multilevel"/>
     <w:tmpl w:val="8FDA0FE2"/>
@@ -5492,7 +7158,156 @@
       </w:rPr>
     </w:lvl>
   </w:abstractNum>
-  <w:abstractNum w:abstractNumId="34" w15:restartNumberingAfterBreak="0">
+  <w:abstractNum w:abstractNumId="38" w15:restartNumberingAfterBreak="0">
+    <w:nsid w:val="751E5F60"/>
+    <w:multiLevelType w:val="multilevel"/>
+    <w:tmpl w:val="3C88BC54"/>
+    <w:lvl w:ilvl="0">
+      <w:start w:val="1"/>
+      <w:numFmt w:val="bullet"/>
+      <w:lvlText w:val=""/>
+      <w:lvlJc w:val="left"/>
+      <w:pPr>
+        <w:tabs>
+          <w:tab w:val="num" w:pos="720"/>
+        </w:tabs>
+        <w:ind w:left="720" w:hanging="360"/>
+      </w:pPr>
+      <w:rPr>
+        <w:rFonts w:ascii="Symbol" w:hAnsi="Symbol" w:hint="default"/>
+        <w:sz w:val="20"/>
+      </w:rPr>
+    </w:lvl>
+    <w:lvl w:ilvl="1" w:tentative="1">
+      <w:start w:val="1"/>
+      <w:numFmt w:val="bullet"/>
+      <w:lvlText w:val="o"/>
+      <w:lvlJc w:val="left"/>
+      <w:pPr>
+        <w:tabs>
+          <w:tab w:val="num" w:pos="1440"/>
+        </w:tabs>
+        <w:ind w:left="1440" w:hanging="360"/>
+      </w:pPr>
+      <w:rPr>
+        <w:rFonts w:ascii="Courier New" w:hAnsi="Courier New" w:hint="default"/>
+        <w:sz w:val="20"/>
+      </w:rPr>
+    </w:lvl>
+    <w:lvl w:ilvl="2" w:tentative="1">
+      <w:start w:val="1"/>
+      <w:numFmt w:val="bullet"/>
+      <w:lvlText w:val=""/>
+      <w:lvlJc w:val="left"/>
+      <w:pPr>
+        <w:tabs>
+          <w:tab w:val="num" w:pos="2160"/>
+        </w:tabs>
+        <w:ind w:left="2160" w:hanging="360"/>
+      </w:pPr>
+      <w:rPr>
+        <w:rFonts w:ascii="Wingdings" w:hAnsi="Wingdings" w:hint="default"/>
+        <w:sz w:val="20"/>
+      </w:rPr>
+    </w:lvl>
+    <w:lvl w:ilvl="3" w:tentative="1">
+      <w:start w:val="1"/>
+      <w:numFmt w:val="bullet"/>
+      <w:lvlText w:val=""/>
+      <w:lvlJc w:val="left"/>
+      <w:pPr>
+        <w:tabs>
+          <w:tab w:val="num" w:pos="2880"/>
+        </w:tabs>
+        <w:ind w:left="2880" w:hanging="360"/>
+      </w:pPr>
+      <w:rPr>
+        <w:rFonts w:ascii="Wingdings" w:hAnsi="Wingdings" w:hint="default"/>
+        <w:sz w:val="20"/>
+      </w:rPr>
+    </w:lvl>
+    <w:lvl w:ilvl="4" w:tentative="1">
+      <w:start w:val="1"/>
+      <w:numFmt w:val="bullet"/>
+      <w:lvlText w:val=""/>
+      <w:lvlJc w:val="left"/>
+      <w:pPr>
+        <w:tabs>
+          <w:tab w:val="num" w:pos="3600"/>
+        </w:tabs>
+        <w:ind w:left="3600" w:hanging="360"/>
+      </w:pPr>
+      <w:rPr>
+        <w:rFonts w:ascii="Wingdings" w:hAnsi="Wingdings" w:hint="default"/>
+        <w:sz w:val="20"/>
+      </w:rPr>
+    </w:lvl>
+    <w:lvl w:ilvl="5" w:tentative="1">
+      <w:start w:val="1"/>
+      <w:numFmt w:val="bullet"/>
+      <w:lvlText w:val=""/>
+      <w:lvlJc w:val="left"/>
+      <w:pPr>
+        <w:tabs>
+          <w:tab w:val="num" w:pos="4320"/>
+        </w:tabs>
+        <w:ind w:left="4320" w:hanging="360"/>
+      </w:pPr>
+      <w:rPr>
+        <w:rFonts w:ascii="Wingdings" w:hAnsi="Wingdings" w:hint="default"/>
+        <w:sz w:val="20"/>
+      </w:rPr>
+    </w:lvl>
+    <w:lvl w:ilvl="6" w:tentative="1">
+      <w:start w:val="1"/>
+      <w:numFmt w:val="bullet"/>
+      <w:lvlText w:val=""/>
+      <w:lvlJc w:val="left"/>
+      <w:pPr>
+        <w:tabs>
+          <w:tab w:val="num" w:pos="5040"/>
+        </w:tabs>
+        <w:ind w:left="5040" w:hanging="360"/>
+      </w:pPr>
+      <w:rPr>
+        <w:rFonts w:ascii="Wingdings" w:hAnsi="Wingdings" w:hint="default"/>
+        <w:sz w:val="20"/>
+      </w:rPr>
+    </w:lvl>
+    <w:lvl w:ilvl="7" w:tentative="1">
+      <w:start w:val="1"/>
+      <w:numFmt w:val="bullet"/>
+      <w:lvlText w:val=""/>
+      <w:lvlJc w:val="left"/>
+      <w:pPr>
+        <w:tabs>
+          <w:tab w:val="num" w:pos="5760"/>
+        </w:tabs>
+        <w:ind w:left="5760" w:hanging="360"/>
+      </w:pPr>
+      <w:rPr>
+        <w:rFonts w:ascii="Wingdings" w:hAnsi="Wingdings" w:hint="default"/>
+        <w:sz w:val="20"/>
+      </w:rPr>
+    </w:lvl>
+    <w:lvl w:ilvl="8" w:tentative="1">
+      <w:start w:val="1"/>
+      <w:numFmt w:val="bullet"/>
+      <w:lvlText w:val=""/>
+      <w:lvlJc w:val="left"/>
+      <w:pPr>
+        <w:tabs>
+          <w:tab w:val="num" w:pos="6480"/>
+        </w:tabs>
+        <w:ind w:left="6480" w:hanging="360"/>
+      </w:pPr>
+      <w:rPr>
+        <w:rFonts w:ascii="Wingdings" w:hAnsi="Wingdings" w:hint="default"/>
+        <w:sz w:val="20"/>
+      </w:rPr>
+    </w:lvl>
+  </w:abstractNum>
+  <w:abstractNum w:abstractNumId="39" w15:restartNumberingAfterBreak="0">
     <w:nsid w:val="765D186B"/>
     <w:multiLevelType w:val="hybridMultilevel"/>
     <w:tmpl w:val="54468868"/>
@@ -5578,7 +7393,7 @@
       </w:pPr>
     </w:lvl>
   </w:abstractNum>
-  <w:abstractNum w:abstractNumId="35" w15:restartNumberingAfterBreak="0">
+  <w:abstractNum w:abstractNumId="40" w15:restartNumberingAfterBreak="0">
     <w:nsid w:val="7718179A"/>
     <w:multiLevelType w:val="hybridMultilevel"/>
     <w:tmpl w:val="2AB26018"/>
@@ -5691,112 +7506,127 @@
     </w:lvl>
   </w:abstractNum>
   <w:num w:numId="1" w16cid:durableId="1803841739">
-    <w:abstractNumId w:val="24"/>
+    <w:abstractNumId w:val="27"/>
   </w:num>
   <w:num w:numId="2" w16cid:durableId="1199659246">
+    <w:abstractNumId w:val="23"/>
+  </w:num>
+  <w:num w:numId="3" w16cid:durableId="1194076578">
+    <w:abstractNumId w:val="21"/>
+  </w:num>
+  <w:num w:numId="4" w16cid:durableId="1746536645">
+    <w:abstractNumId w:val="31"/>
+  </w:num>
+  <w:num w:numId="5" w16cid:durableId="794056892">
+    <w:abstractNumId w:val="14"/>
+  </w:num>
+  <w:num w:numId="6" w16cid:durableId="49308037">
+    <w:abstractNumId w:val="32"/>
+  </w:num>
+  <w:num w:numId="7" w16cid:durableId="859902205">
+    <w:abstractNumId w:val="13"/>
+  </w:num>
+  <w:num w:numId="8" w16cid:durableId="696739804">
+    <w:abstractNumId w:val="26"/>
+  </w:num>
+  <w:num w:numId="9" w16cid:durableId="2041466325">
+    <w:abstractNumId w:val="35"/>
+  </w:num>
+  <w:num w:numId="10" w16cid:durableId="1485857822">
+    <w:abstractNumId w:val="33"/>
+  </w:num>
+  <w:num w:numId="11" w16cid:durableId="1415128607">
+    <w:abstractNumId w:val="7"/>
+  </w:num>
+  <w:num w:numId="12" w16cid:durableId="455291383">
     <w:abstractNumId w:val="20"/>
   </w:num>
-  <w:num w:numId="3" w16cid:durableId="1194076578">
-    <w:abstractNumId w:val="18"/>
+  <w:num w:numId="13" w16cid:durableId="980764972">
+    <w:abstractNumId w:val="22"/>
   </w:num>
-  <w:num w:numId="4" w16cid:durableId="1746536645">
-    <w:abstractNumId w:val="28"/>
+  <w:num w:numId="14" w16cid:durableId="1863319608">
+    <w:abstractNumId w:val="40"/>
   </w:num>
-  <w:num w:numId="5" w16cid:durableId="794056892">
-    <w:abstractNumId w:val="11"/>
-  </w:num>
-  <w:num w:numId="6" w16cid:durableId="49308037">
-    <w:abstractNumId w:val="29"/>
-  </w:num>
-  <w:num w:numId="7" w16cid:durableId="859902205">
-    <w:abstractNumId w:val="10"/>
-  </w:num>
-  <w:num w:numId="8" w16cid:durableId="696739804">
-    <w:abstractNumId w:val="23"/>
-  </w:num>
-  <w:num w:numId="9" w16cid:durableId="2041466325">
-    <w:abstractNumId w:val="31"/>
-  </w:num>
-  <w:num w:numId="10" w16cid:durableId="1485857822">
-    <w:abstractNumId w:val="30"/>
-  </w:num>
-  <w:num w:numId="11" w16cid:durableId="1415128607">
-    <w:abstractNumId w:val="5"/>
-  </w:num>
-  <w:num w:numId="12" w16cid:durableId="455291383">
-    <w:abstractNumId w:val="17"/>
-  </w:num>
-  <w:num w:numId="13" w16cid:durableId="980764972">
+  <w:num w:numId="15" w16cid:durableId="799881605">
     <w:abstractNumId w:val="19"/>
   </w:num>
-  <w:num w:numId="14" w16cid:durableId="1863319608">
-    <w:abstractNumId w:val="35"/>
-  </w:num>
-  <w:num w:numId="15" w16cid:durableId="799881605">
-    <w:abstractNumId w:val="16"/>
-  </w:num>
   <w:num w:numId="16" w16cid:durableId="24985640">
-    <w:abstractNumId w:val="3"/>
+    <w:abstractNumId w:val="4"/>
   </w:num>
   <w:num w:numId="17" w16cid:durableId="1810904904">
-    <w:abstractNumId w:val="9"/>
+    <w:abstractNumId w:val="12"/>
   </w:num>
   <w:num w:numId="18" w16cid:durableId="952519709">
-    <w:abstractNumId w:val="34"/>
+    <w:abstractNumId w:val="39"/>
   </w:num>
   <w:num w:numId="19" w16cid:durableId="291329094">
     <w:abstractNumId w:val="1"/>
   </w:num>
   <w:num w:numId="20" w16cid:durableId="1065296152">
-    <w:abstractNumId w:val="15"/>
+    <w:abstractNumId w:val="18"/>
   </w:num>
   <w:num w:numId="21" w16cid:durableId="2143032134">
     <w:abstractNumId w:val="0"/>
   </w:num>
   <w:num w:numId="22" w16cid:durableId="556090788">
-    <w:abstractNumId w:val="27"/>
+    <w:abstractNumId w:val="30"/>
   </w:num>
   <w:num w:numId="23" w16cid:durableId="1688823654">
-    <w:abstractNumId w:val="22"/>
+    <w:abstractNumId w:val="25"/>
   </w:num>
   <w:num w:numId="24" w16cid:durableId="1470443640">
-    <w:abstractNumId w:val="7"/>
+    <w:abstractNumId w:val="9"/>
   </w:num>
   <w:num w:numId="25" w16cid:durableId="1645428588">
-    <w:abstractNumId w:val="26"/>
+    <w:abstractNumId w:val="29"/>
   </w:num>
   <w:num w:numId="26" w16cid:durableId="994989806">
-    <w:abstractNumId w:val="25"/>
+    <w:abstractNumId w:val="28"/>
   </w:num>
   <w:num w:numId="27" w16cid:durableId="1022897599">
-    <w:abstractNumId w:val="32"/>
+    <w:abstractNumId w:val="36"/>
   </w:num>
   <w:num w:numId="28" w16cid:durableId="715667673">
-    <w:abstractNumId w:val="21"/>
+    <w:abstractNumId w:val="24"/>
   </w:num>
   <w:num w:numId="29" w16cid:durableId="2125299567">
-    <w:abstractNumId w:val="4"/>
+    <w:abstractNumId w:val="5"/>
   </w:num>
   <w:num w:numId="30" w16cid:durableId="1974361813">
-    <w:abstractNumId w:val="13"/>
+    <w:abstractNumId w:val="16"/>
   </w:num>
   <w:num w:numId="31" w16cid:durableId="126516313">
-    <w:abstractNumId w:val="14"/>
+    <w:abstractNumId w:val="17"/>
   </w:num>
   <w:num w:numId="32" w16cid:durableId="1567447419">
+    <w:abstractNumId w:val="8"/>
+  </w:num>
+  <w:num w:numId="33" w16cid:durableId="63920808">
+    <w:abstractNumId w:val="3"/>
+  </w:num>
+  <w:num w:numId="34" w16cid:durableId="895168839">
+    <w:abstractNumId w:val="11"/>
+  </w:num>
+  <w:num w:numId="35" w16cid:durableId="1472287875">
+    <w:abstractNumId w:val="15"/>
+  </w:num>
+  <w:num w:numId="36" w16cid:durableId="1540781211">
+    <w:abstractNumId w:val="37"/>
+  </w:num>
+  <w:num w:numId="37" w16cid:durableId="1859616286">
+    <w:abstractNumId w:val="34"/>
+  </w:num>
+  <w:num w:numId="38" w16cid:durableId="488668119">
     <w:abstractNumId w:val="6"/>
   </w:num>
-  <w:num w:numId="33" w16cid:durableId="63920808">
+  <w:num w:numId="39" w16cid:durableId="2134976747">
+    <w:abstractNumId w:val="10"/>
+  </w:num>
+  <w:num w:numId="40" w16cid:durableId="408504547">
     <w:abstractNumId w:val="2"/>
   </w:num>
-  <w:num w:numId="34" w16cid:durableId="895168839">
-    <w:abstractNumId w:val="8"/>
-  </w:num>
-  <w:num w:numId="35" w16cid:durableId="1472287875">
-    <w:abstractNumId w:val="12"/>
-  </w:num>
-  <w:num w:numId="36" w16cid:durableId="1540781211">
-    <w:abstractNumId w:val="33"/>
+  <w:num w:numId="41" w16cid:durableId="794642144">
+    <w:abstractNumId w:val="38"/>
   </w:num>
 </w:numbering>
 </file>
@@ -6256,10 +8086,30 @@
       <w:szCs w:val="26"/>
     </w:rPr>
   </w:style>
+  <w:style w:type="paragraph" w:styleId="Heading3">
+    <w:name w:val="heading 3"/>
+    <w:basedOn w:val="Normal"/>
+    <w:next w:val="Normal"/>
+    <w:link w:val="Heading3Char"/>
+    <w:uiPriority w:val="9"/>
+    <w:semiHidden/>
+    <w:unhideWhenUsed/>
+    <w:qFormat/>
+    <w:rsid w:val="00340678"/>
+    <w:pPr>
+      <w:keepNext/>
+      <w:keepLines/>
+      <w:spacing w:before="40" w:after="0"/>
+      <w:outlineLvl w:val="2"/>
+    </w:pPr>
+    <w:rPr>
+      <w:rFonts w:asciiTheme="majorHAnsi" w:eastAsiaTheme="majorEastAsia" w:hAnsiTheme="majorHAnsi" w:cstheme="majorBidi"/>
+      <w:color w:val="1F3763" w:themeColor="accent1" w:themeShade="7F"/>
+    </w:rPr>
+  </w:style>
   <w:style w:type="character" w:default="1" w:styleId="DefaultParagraphFont">
     <w:name w:val="Default Paragraph Font"/>
     <w:uiPriority w:val="1"/>
-    <w:semiHidden/>
     <w:unhideWhenUsed/>
   </w:style>
   <w:style w:type="table" w:default="1" w:styleId="TableNormal">
@@ -6438,6 +8288,18 @@
         <w:insideV w:val="single" w:sz="4" w:space="0" w:color="auto"/>
       </w:tblBorders>
     </w:tblPr>
+  </w:style>
+  <w:style w:type="character" w:customStyle="1" w:styleId="Heading3Char">
+    <w:name w:val="Heading 3 Char"/>
+    <w:basedOn w:val="DefaultParagraphFont"/>
+    <w:link w:val="Heading3"/>
+    <w:uiPriority w:val="9"/>
+    <w:semiHidden/>
+    <w:rsid w:val="00340678"/>
+    <w:rPr>
+      <w:rFonts w:asciiTheme="majorHAnsi" w:eastAsiaTheme="majorEastAsia" w:hAnsiTheme="majorHAnsi" w:cstheme="majorBidi"/>
+      <w:color w:val="1F3763" w:themeColor="accent1" w:themeShade="7F"/>
+    </w:rPr>
   </w:style>
 </w:styles>
 </file>

</xml_diff>